<commit_message>
docs: complete assignment 2 design pattern report
</commit_message>
<xml_diff>
--- a/作业2/2026作业2.docx
+++ b/作业2/2026作业2.docx
@@ -15,7 +15,7 @@
       </w:pPr>
       <w:r>
         <w:rPr>
-          <w:rFonts w:ascii="宋体" w:hint="eastAsia"/>
+          <w:rFonts w:ascii="宋体" w:hint="eastAsia" w:hAnsi="宋体" w:eastAsia="宋体"/>
           <w:b/>
           <w:sz w:val="48"/>
           <w:szCs w:val="48"/>
@@ -24,7 +24,7 @@
       </w:r>
       <w:r>
         <w:rPr>
-          <w:rFonts w:ascii="宋体"/>
+          <w:rFonts w:ascii="宋体" w:hAnsi="宋体" w:eastAsia="宋体"/>
           <w:b/>
           <w:sz w:val="48"/>
           <w:szCs w:val="48"/>
@@ -33,7 +33,7 @@
       </w:r>
       <w:r>
         <w:rPr>
-          <w:rFonts w:ascii="宋体" w:hint="eastAsia"/>
+          <w:rFonts w:ascii="宋体" w:hint="eastAsia" w:hAnsi="宋体" w:eastAsia="宋体"/>
           <w:b/>
           <w:sz w:val="48"/>
           <w:szCs w:val="48"/>
@@ -53,7 +53,7 @@
       </w:pPr>
       <w:r>
         <w:rPr>
-          <w:rFonts w:ascii="宋体" w:hint="eastAsia"/>
+          <w:rFonts w:ascii="宋体" w:hint="eastAsia" w:hAnsi="宋体" w:eastAsia="宋体"/>
           <w:b/>
           <w:sz w:val="48"/>
           <w:szCs w:val="48"/>
@@ -62,7 +62,7 @@
       </w:r>
       <w:r>
         <w:rPr>
-          <w:rFonts w:ascii="宋体" w:hint="eastAsia"/>
+          <w:rFonts w:ascii="宋体" w:hint="eastAsia" w:hAnsi="宋体" w:eastAsia="宋体"/>
           <w:b/>
           <w:sz w:val="48"/>
           <w:szCs w:val="48"/>
@@ -102,7 +102,7 @@
       </w:pPr>
       <w:r>
         <w:rPr>
-          <w:rFonts w:hint="eastAsia"/>
+          <w:rFonts w:hint="eastAsia" w:ascii="宋体" w:hAnsi="宋体" w:eastAsia="宋体"/>
           <w:b/>
           <w:sz w:val="28"/>
         </w:rPr>
@@ -110,7 +110,7 @@
       </w:r>
       <w:r>
         <w:rPr>
-          <w:rFonts w:hint="eastAsia"/>
+          <w:rFonts w:hint="eastAsia" w:ascii="宋体" w:hAnsi="宋体" w:eastAsia="宋体"/>
           <w:b/>
           <w:sz w:val="28"/>
         </w:rPr>
@@ -118,7 +118,7 @@
       </w:r>
       <w:r>
         <w:rPr>
-          <w:rFonts w:hint="eastAsia"/>
+          <w:rFonts w:hint="eastAsia" w:ascii="宋体" w:hAnsi="宋体" w:eastAsia="宋体"/>
           <w:b/>
           <w:sz w:val="28"/>
         </w:rPr>
@@ -126,7 +126,7 @@
       </w:r>
       <w:r>
         <w:rPr>
-          <w:rFonts w:cs="宋体" w:hint="eastAsia"/>
+          <w:rFonts w:cs="宋体" w:hint="eastAsia" w:ascii="宋体" w:hAnsi="宋体" w:eastAsia="宋体"/>
           <w:b/>
           <w:bCs/>
           <w:sz w:val="24"/>
@@ -136,7 +136,7 @@
       </w:r>
       <w:r>
         <w:rPr>
-          <w:rFonts w:cs="宋体"/>
+          <w:rFonts w:cs="宋体" w:ascii="宋体" w:hAnsi="宋体" w:eastAsia="宋体"/>
           <w:b/>
           <w:bCs/>
           <w:sz w:val="24"/>
@@ -146,7 +146,7 @@
       </w:r>
       <w:r>
         <w:rPr>
-          <w:rFonts w:cs="宋体" w:hint="eastAsia"/>
+          <w:rFonts w:cs="宋体" w:hint="eastAsia" w:ascii="宋体" w:hAnsi="宋体" w:eastAsia="宋体"/>
           <w:b/>
           <w:bCs/>
           <w:sz w:val="24"/>
@@ -156,7 +156,7 @@
       </w:r>
       <w:r>
         <w:rPr>
-          <w:rFonts w:cs="宋体" w:hint="eastAsia"/>
+          <w:rFonts w:cs="宋体" w:hint="eastAsia" w:ascii="宋体" w:hAnsi="宋体" w:eastAsia="宋体"/>
           <w:b/>
           <w:bCs/>
           <w:sz w:val="24"/>
@@ -166,7 +166,7 @@
       </w:r>
       <w:r>
         <w:rPr>
-          <w:rFonts w:cs="宋体" w:hint="eastAsia"/>
+          <w:rFonts w:cs="宋体" w:hint="eastAsia" w:ascii="宋体" w:hAnsi="宋体" w:eastAsia="宋体"/>
           <w:b/>
           <w:bCs/>
           <w:sz w:val="24"/>
@@ -176,7 +176,7 @@
       </w:r>
       <w:r>
         <w:rPr>
-          <w:rFonts w:cs="宋体" w:hint="eastAsia"/>
+          <w:rFonts w:cs="宋体" w:hint="eastAsia" w:ascii="宋体" w:hAnsi="宋体" w:eastAsia="宋体"/>
           <w:b/>
           <w:bCs/>
           <w:sz w:val="24"/>
@@ -186,7 +186,7 @@
       </w:r>
       <w:r>
         <w:rPr>
-          <w:rFonts w:cs="宋体" w:hint="eastAsia"/>
+          <w:rFonts w:cs="宋体" w:hint="eastAsia" w:ascii="宋体" w:hAnsi="宋体" w:eastAsia="宋体"/>
           <w:b/>
           <w:bCs/>
           <w:sz w:val="24"/>
@@ -196,7 +196,7 @@
       </w:r>
       <w:r>
         <w:rPr>
-          <w:rFonts w:cs="宋体"/>
+          <w:rFonts w:cs="宋体" w:ascii="宋体" w:hAnsi="宋体" w:eastAsia="宋体"/>
           <w:b/>
           <w:bCs/>
           <w:sz w:val="24"/>
@@ -206,7 +206,7 @@
       </w:r>
       <w:r>
         <w:rPr>
-          <w:rFonts w:cs="宋体" w:hint="eastAsia"/>
+          <w:rFonts w:cs="宋体" w:hint="eastAsia" w:ascii="宋体" w:hAnsi="宋体" w:eastAsia="宋体"/>
           <w:b/>
           <w:bCs/>
           <w:sz w:val="24"/>
@@ -216,7 +216,7 @@
       </w:r>
       <w:r>
         <w:rPr>
-          <w:rFonts w:cs="宋体" w:hint="eastAsia"/>
+          <w:rFonts w:cs="宋体" w:hint="eastAsia" w:ascii="宋体" w:hAnsi="宋体" w:eastAsia="宋体"/>
           <w:b/>
           <w:bCs/>
           <w:sz w:val="28"/>
@@ -227,7 +227,7 @@
       </w:r>
       <w:r>
         <w:rPr>
-          <w:rFonts w:cs="宋体" w:hint="eastAsia"/>
+          <w:rFonts w:cs="宋体" w:hint="eastAsia" w:ascii="宋体" w:hAnsi="宋体" w:eastAsia="宋体"/>
           <w:b/>
           <w:bCs/>
           <w:sz w:val="28"/>
@@ -238,7 +238,7 @@
       </w:r>
       <w:r>
         <w:rPr>
-          <w:rFonts w:cs="宋体" w:hint="eastAsia"/>
+          <w:rFonts w:cs="宋体" w:hint="eastAsia" w:ascii="宋体" w:hAnsi="宋体" w:eastAsia="宋体"/>
           <w:b/>
           <w:bCs/>
           <w:sz w:val="28"/>
@@ -249,6 +249,7 @@
       </w:r>
       <w:r>
         <w:rPr>
+          <w:rFonts w:ascii="宋体" w:hAnsi="宋体" w:eastAsia="宋体"/>
           <w:b/>
           <w:bCs/>
           <w:sz w:val="28"/>
@@ -269,7 +270,7 @@
       </w:pPr>
       <w:r>
         <w:rPr>
-          <w:rFonts w:hint="eastAsia"/>
+          <w:rFonts w:hint="eastAsia" w:ascii="宋体" w:hAnsi="宋体" w:eastAsia="宋体"/>
           <w:b/>
           <w:sz w:val="28"/>
         </w:rPr>
@@ -277,7 +278,7 @@
       </w:r>
       <w:r>
         <w:rPr>
-          <w:rFonts w:hint="eastAsia"/>
+          <w:rFonts w:hint="eastAsia" w:ascii="宋体" w:hAnsi="宋体" w:eastAsia="宋体"/>
           <w:b/>
           <w:sz w:val="28"/>
         </w:rPr>
@@ -285,7 +286,7 @@
       </w:r>
       <w:r>
         <w:rPr>
-          <w:rFonts w:hint="eastAsia"/>
+          <w:rFonts w:hint="eastAsia" w:ascii="宋体" w:hAnsi="宋体" w:eastAsia="宋体"/>
           <w:b/>
           <w:sz w:val="28"/>
         </w:rPr>
@@ -293,6 +294,7 @@
       </w:r>
       <w:r>
         <w:rPr>
+          <w:rFonts w:ascii="宋体" w:hAnsi="宋体" w:eastAsia="宋体"/>
           <w:b/>
           <w:bCs/>
           <w:color w:val="000000"/>
@@ -304,7 +306,7 @@
       </w:r>
       <w:r>
         <w:rPr>
-          <w:rFonts w:hint="eastAsia"/>
+          <w:rFonts w:hint="eastAsia" w:ascii="宋体" w:hAnsi="宋体" w:eastAsia="宋体"/>
           <w:b/>
           <w:bCs/>
           <w:color w:val="000000"/>
@@ -316,6 +318,7 @@
       </w:r>
       <w:r>
         <w:rPr>
+          <w:rFonts w:ascii="宋体" w:hAnsi="宋体" w:eastAsia="宋体"/>
           <w:b/>
           <w:bCs/>
           <w:color w:val="000000"/>
@@ -327,6 +330,7 @@
       </w:r>
       <w:r>
         <w:rPr>
+          <w:rFonts w:ascii="宋体" w:hAnsi="宋体" w:eastAsia="宋体"/>
           <w:b/>
           <w:bCs/>
           <w:color w:val="000000"/>
@@ -347,29 +351,15 @@
       </w:pPr>
       <w:r>
         <w:rPr>
-          <w:rFonts w:hint="eastAsia"/>
-          <w:b/>
-          <w:sz w:val="28"/>
-        </w:rPr>
-        <w:t xml:space="preserve">      </w:t>
-      </w:r>
-      <w:r>
-        <w:rPr>
-          <w:rFonts w:hint="eastAsia"/>
-          <w:b/>
-          <w:sz w:val="28"/>
-        </w:rPr>
-        <w:t>报告人</w:t>
-      </w:r>
-      <w:r>
-        <w:rPr>
-          <w:rFonts w:hint="eastAsia"/>
-          <w:b/>
-          <w:sz w:val="28"/>
-        </w:rPr>
-        <w:t>：</w:t>
-      </w:r>
-      <w:r>
+          <w:rFonts w:ascii="宋体" w:hAnsi="宋体" w:eastAsia="宋体"/>
+        </w:rPr>
+        <w:t>报告人：姜言达             学号：2023150117            班级：周三</w:t>
+      </w:r>
+    </w:p>
+    <w:p>
+      <w:pPr>
+        <w:spacing w:beforeLines="100" w:before="312" w:afterLines="100" w:after="312"/>
+        <w:ind w:firstLineChars="300" w:firstLine="843"/>
         <w:rPr>
           <w:b/>
           <w:bCs/>
@@ -378,26 +368,81 @@
           <w:szCs w:val="28"/>
           <w:u w:val="single"/>
         </w:rPr>
-        <w:t xml:space="preserve">             </w:t>
-      </w:r>
-      <w:r>
-        <w:rPr>
-          <w:rFonts w:hint="eastAsia"/>
-          <w:b/>
+      </w:pPr>
+      <w:r>
+        <w:rPr>
+          <w:rFonts w:ascii="宋体" w:hAnsi="宋体" w:eastAsia="宋体"/>
+        </w:rPr>
+        <w:t>报告提交时间：2026年7月2日</w:t>
+      </w:r>
+    </w:p>
+    <w:p>
+      <w:pPr>
+        <w:spacing w:beforeLines="100" w:before="312" w:afterLines="100" w:after="312"/>
+        <w:ind w:firstLineChars="300" w:firstLine="843"/>
+        <w:rPr>
+          <w:b/>
+          <w:sz w:val="44"/>
+        </w:rPr>
+      </w:pPr>
+      <w:r>
+        <w:rPr>
+          <w:rFonts w:hint="eastAsia" w:ascii="宋体" w:hAnsi="宋体" w:eastAsia="宋体"/>
+          <w:b/>
+          <w:bCs/>
+          <w:color w:val="000000"/>
           <w:sz w:val="28"/>
-        </w:rPr>
-        <w:t>学号</w:t>
-      </w:r>
-      <w:r>
-        <w:rPr>
-          <w:rFonts w:hint="eastAsia"/>
-          <w:b/>
+          <w:szCs w:val="28"/>
+        </w:rPr>
+        <w:t>成</w:t>
+      </w:r>
+      <w:r>
+        <w:rPr>
+          <w:rFonts w:hint="eastAsia" w:ascii="宋体" w:hAnsi="宋体" w:eastAsia="宋体"/>
+          <w:b/>
+          <w:bCs/>
+          <w:color w:val="000000"/>
           <w:sz w:val="28"/>
+          <w:szCs w:val="28"/>
+        </w:rPr>
+        <w:t xml:space="preserve">  </w:t>
+      </w:r>
+      <w:r>
+        <w:rPr>
+          <w:rFonts w:hint="eastAsia" w:ascii="宋体" w:hAnsi="宋体" w:eastAsia="宋体"/>
+          <w:b/>
+          <w:bCs/>
+          <w:color w:val="000000"/>
+          <w:sz w:val="28"/>
+          <w:szCs w:val="28"/>
+        </w:rPr>
+        <w:t>绩</w:t>
+      </w:r>
+      <w:r>
+        <w:rPr>
+          <w:rFonts w:ascii="宋体" w:hAnsi="宋体" w:eastAsia="宋体"/>
+          <w:b/>
+          <w:bCs/>
+          <w:color w:val="000000"/>
+          <w:sz w:val="28"/>
+          <w:szCs w:val="28"/>
         </w:rPr>
         <w:t>：</w:t>
       </w:r>
       <w:r>
         <w:rPr>
+          <w:rFonts w:hint="eastAsia" w:ascii="宋体" w:hAnsi="宋体" w:eastAsia="宋体"/>
+          <w:b/>
+          <w:bCs/>
+          <w:color w:val="000000"/>
+          <w:sz w:val="28"/>
+          <w:szCs w:val="28"/>
+        </w:rPr>
+        <w:t xml:space="preserve">   </w:t>
+      </w:r>
+      <w:r>
+        <w:rPr>
+          <w:rFonts w:hint="eastAsia" w:ascii="宋体" w:hAnsi="宋体" w:eastAsia="宋体"/>
           <w:b/>
           <w:bCs/>
           <w:color w:val="000000"/>
@@ -405,18 +450,11 @@
           <w:szCs w:val="28"/>
           <w:u w:val="single"/>
         </w:rPr>
-        <w:t xml:space="preserve">            </w:t>
-      </w:r>
-      <w:r>
-        <w:rPr>
-          <w:rFonts w:hint="eastAsia"/>
-          <w:b/>
-          <w:sz w:val="28"/>
-        </w:rPr>
-        <w:t>班级：</w:t>
-      </w:r>
-      <w:r>
-        <w:rPr>
+        <w:t xml:space="preserve">                 </w:t>
+      </w:r>
+      <w:r>
+        <w:rPr>
+          <w:rFonts w:hint="eastAsia" w:ascii="宋体" w:hAnsi="宋体" w:eastAsia="宋体"/>
           <w:b/>
           <w:bCs/>
           <w:color w:val="000000"/>
@@ -424,10 +462,11 @@
           <w:szCs w:val="28"/>
           <w:u w:val="single"/>
         </w:rPr>
-        <w:t xml:space="preserve">      </w:t>
-      </w:r>
-      <w:r>
-        <w:rPr>
+        <w:t xml:space="preserve">                 </w:t>
+      </w:r>
+      <w:r>
+        <w:rPr>
+          <w:rFonts w:hint="eastAsia" w:ascii="宋体" w:hAnsi="宋体" w:eastAsia="宋体"/>
           <w:b/>
           <w:bCs/>
           <w:color w:val="000000"/>
@@ -435,158 +474,6 @@
           <w:szCs w:val="28"/>
           <w:u w:val="single"/>
         </w:rPr>
-        <w:t xml:space="preserve"> </w:t>
-      </w:r>
-      <w:r>
-        <w:rPr>
-          <w:b/>
-          <w:bCs/>
-          <w:color w:val="000000"/>
-          <w:sz w:val="28"/>
-          <w:szCs w:val="28"/>
-          <w:u w:val="single"/>
-        </w:rPr>
-        <w:t xml:space="preserve">        </w:t>
-      </w:r>
-      <w:r>
-        <w:rPr>
-          <w:rFonts w:hint="eastAsia"/>
-          <w:b/>
-          <w:sz w:val="28"/>
-        </w:rPr>
-        <w:t xml:space="preserve">   </w:t>
-      </w:r>
-    </w:p>
-    <w:p>
-      <w:pPr>
-        <w:spacing w:beforeLines="100" w:before="312" w:afterLines="100" w:after="312"/>
-        <w:ind w:firstLineChars="300" w:firstLine="843"/>
-        <w:rPr>
-          <w:b/>
-          <w:bCs/>
-          <w:color w:val="000000"/>
-          <w:sz w:val="28"/>
-          <w:szCs w:val="28"/>
-          <w:u w:val="single"/>
-        </w:rPr>
-      </w:pPr>
-      <w:r>
-        <w:rPr>
-          <w:rFonts w:hint="eastAsia"/>
-          <w:b/>
-          <w:sz w:val="28"/>
-        </w:rPr>
-        <w:t>报告提交时间：</w:t>
-      </w:r>
-      <w:r>
-        <w:rPr>
-          <w:b/>
-          <w:bCs/>
-          <w:color w:val="000000"/>
-          <w:sz w:val="28"/>
-          <w:szCs w:val="28"/>
-          <w:u w:val="single"/>
-        </w:rPr>
-        <w:t xml:space="preserve">                                       </w:t>
-      </w:r>
-    </w:p>
-    <w:p>
-      <w:pPr>
-        <w:spacing w:beforeLines="100" w:before="312" w:afterLines="100" w:after="312"/>
-        <w:ind w:firstLineChars="300" w:firstLine="843"/>
-        <w:rPr>
-          <w:b/>
-          <w:sz w:val="44"/>
-        </w:rPr>
-      </w:pPr>
-      <w:r>
-        <w:rPr>
-          <w:rFonts w:hint="eastAsia"/>
-          <w:b/>
-          <w:bCs/>
-          <w:color w:val="000000"/>
-          <w:sz w:val="28"/>
-          <w:szCs w:val="28"/>
-        </w:rPr>
-        <w:t>成</w:t>
-      </w:r>
-      <w:r>
-        <w:rPr>
-          <w:rFonts w:hint="eastAsia"/>
-          <w:b/>
-          <w:bCs/>
-          <w:color w:val="000000"/>
-          <w:sz w:val="28"/>
-          <w:szCs w:val="28"/>
-        </w:rPr>
-        <w:t xml:space="preserve">  </w:t>
-      </w:r>
-      <w:r>
-        <w:rPr>
-          <w:rFonts w:hint="eastAsia"/>
-          <w:b/>
-          <w:bCs/>
-          <w:color w:val="000000"/>
-          <w:sz w:val="28"/>
-          <w:szCs w:val="28"/>
-        </w:rPr>
-        <w:t>绩</w:t>
-      </w:r>
-      <w:r>
-        <w:rPr>
-          <w:b/>
-          <w:bCs/>
-          <w:color w:val="000000"/>
-          <w:sz w:val="28"/>
-          <w:szCs w:val="28"/>
-        </w:rPr>
-        <w:t>：</w:t>
-      </w:r>
-      <w:r>
-        <w:rPr>
-          <w:rFonts w:hint="eastAsia"/>
-          <w:b/>
-          <w:bCs/>
-          <w:color w:val="000000"/>
-          <w:sz w:val="28"/>
-          <w:szCs w:val="28"/>
-        </w:rPr>
-        <w:t xml:space="preserve">   </w:t>
-      </w:r>
-      <w:r>
-        <w:rPr>
-          <w:rFonts w:hint="eastAsia"/>
-          <w:b/>
-          <w:bCs/>
-          <w:color w:val="000000"/>
-          <w:sz w:val="28"/>
-          <w:szCs w:val="28"/>
-          <w:u w:val="single"/>
-        </w:rPr>
-        <w:t xml:space="preserve">                 </w:t>
-      </w:r>
-      <w:r>
-        <w:rPr>
-          <w:rFonts w:hint="eastAsia"/>
-          <w:b/>
-          <w:bCs/>
-          <w:color w:val="000000"/>
-          <w:sz w:val="28"/>
-          <w:szCs w:val="28"/>
-          <w:u w:val="single"/>
-        </w:rPr>
-        <w:t xml:space="preserve">                 </w:t>
-      </w:r>
-      <w:r>
-        <w:rPr>
-          <w:rFonts w:hint="eastAsia"/>
-          <w:b/>
-          <w:bCs/>
-          <w:color w:val="000000"/>
-          <w:sz w:val="28"/>
-          <w:szCs w:val="28"/>
-          <w:u w:val="single"/>
-        </w:rPr>
         <w:t xml:space="preserve">     </w:t>
       </w:r>
     </w:p>
@@ -602,7 +489,7 @@
     <w:p>
       <w:r>
         <w:rPr>
-          <w:rFonts w:hint="eastAsia"/>
+          <w:rFonts w:hint="eastAsia" w:ascii="宋体" w:hAnsi="宋体" w:eastAsia="宋体"/>
           <w:b/>
         </w:rPr>
         <w:lastRenderedPageBreak/>
@@ -610,18 +497,22 @@
       </w:r>
       <w:r>
         <w:rPr>
-          <w:rFonts w:hint="eastAsia"/>
+          <w:rFonts w:hint="eastAsia" w:ascii="宋体" w:hAnsi="宋体" w:eastAsia="宋体"/>
           <w:b/>
         </w:rPr>
         <w:t>作业</w:t>
       </w:r>
       <w:r>
         <w:rPr>
+          <w:rFonts w:ascii="宋体" w:hAnsi="宋体" w:eastAsia="宋体"/>
           <w:b/>
         </w:rPr>
         <w:t>内容与要求</w:t>
       </w:r>
       <w:r>
+        <w:rPr>
+          <w:rFonts w:ascii="宋体" w:hAnsi="宋体" w:eastAsia="宋体"/>
+        </w:rPr>
         <w:t>：</w:t>
       </w:r>
     </w:p>
@@ -631,105 +522,111 @@
       </w:pPr>
       <w:r>
         <w:rPr>
-          <w:rFonts w:hint="eastAsia"/>
+          <w:rFonts w:hint="eastAsia" w:ascii="宋体" w:hAnsi="宋体" w:eastAsia="宋体"/>
         </w:rPr>
         <w:t>请根据提供的</w:t>
       </w:r>
       <w:r>
         <w:rPr>
-          <w:rFonts w:hint="eastAsia"/>
+          <w:rFonts w:hint="eastAsia" w:ascii="宋体" w:hAnsi="宋体" w:eastAsia="宋体"/>
         </w:rPr>
         <w:t>三维</w:t>
       </w:r>
       <w:r>
         <w:rPr>
-          <w:rFonts w:hint="eastAsia"/>
+          <w:rFonts w:hint="eastAsia" w:ascii="宋体" w:hAnsi="宋体" w:eastAsia="宋体"/>
         </w:rPr>
         <w:t>CAD</w:t>
       </w:r>
       <w:r>
         <w:rPr>
-          <w:rFonts w:hint="eastAsia"/>
+          <w:rFonts w:hint="eastAsia" w:ascii="宋体" w:hAnsi="宋体" w:eastAsia="宋体"/>
         </w:rPr>
         <w:t>软件项目</w:t>
       </w:r>
       <w:r>
         <w:rPr>
-          <w:rFonts w:hint="eastAsia"/>
+          <w:rFonts w:hint="eastAsia" w:ascii="宋体" w:hAnsi="宋体" w:eastAsia="宋体"/>
         </w:rPr>
         <w:t>源码</w:t>
       </w:r>
       <w:proofErr w:type="spellStart"/>
       <w:r>
+        <w:rPr>
+          <w:rFonts w:ascii="宋体" w:hAnsi="宋体" w:eastAsia="宋体"/>
+        </w:rPr>
         <w:t>CADFramework</w:t>
       </w:r>
       <w:proofErr w:type="spellEnd"/>
       <w:r>
         <w:rPr>
-          <w:rFonts w:hint="eastAsia"/>
+          <w:rFonts w:hint="eastAsia" w:ascii="宋体" w:hAnsi="宋体" w:eastAsia="宋体"/>
         </w:rPr>
         <w:t>包，分析使用了哪些设计模式，体现在哪些类之间</w:t>
       </w:r>
       <w:r>
+        <w:rPr>
+          <w:rFonts w:ascii="宋体" w:hAnsi="宋体" w:eastAsia="宋体"/>
+        </w:rPr>
         <w:t>。</w:t>
       </w:r>
       <w:r>
         <w:rPr>
-          <w:rFonts w:hint="eastAsia"/>
+          <w:rFonts w:hint="eastAsia" w:ascii="宋体" w:hAnsi="宋体" w:eastAsia="宋体"/>
         </w:rPr>
         <w:t>要求明确指出</w:t>
       </w:r>
       <w:r>
         <w:rPr>
-          <w:rFonts w:hint="eastAsia"/>
+          <w:rFonts w:hint="eastAsia" w:ascii="宋体" w:hAnsi="宋体" w:eastAsia="宋体"/>
         </w:rPr>
         <w:t>所使用的设计模式的名称，应用在结构中哪些位置（即哪些类之间，画出体现出使用改设计模式的结构类图</w:t>
       </w:r>
       <w:r>
         <w:rPr>
-          <w:rFonts w:hint="eastAsia"/>
+          <w:rFonts w:hint="eastAsia" w:ascii="宋体" w:hAnsi="宋体" w:eastAsia="宋体"/>
         </w:rPr>
         <w:t>，并详细说明每个类的作用</w:t>
       </w:r>
       <w:r>
         <w:rPr>
-          <w:rFonts w:hint="eastAsia"/>
+          <w:rFonts w:hint="eastAsia" w:ascii="宋体" w:hAnsi="宋体" w:eastAsia="宋体"/>
         </w:rPr>
         <w:t>以及在改设计方案中对应哪个角色类</w:t>
       </w:r>
       <w:r>
         <w:rPr>
-          <w:rFonts w:hint="eastAsia"/>
+          <w:rFonts w:hint="eastAsia" w:ascii="宋体" w:hAnsi="宋体" w:eastAsia="宋体"/>
         </w:rPr>
         <w:t>）</w:t>
       </w:r>
       <w:r>
         <w:rPr>
-          <w:rFonts w:hint="eastAsia"/>
+          <w:rFonts w:hint="eastAsia" w:ascii="宋体" w:hAnsi="宋体" w:eastAsia="宋体"/>
         </w:rPr>
         <w:t>，要求指出不低于三种设计模式</w:t>
       </w:r>
       <w:r>
         <w:rPr>
-          <w:rFonts w:hint="eastAsia"/>
+          <w:rFonts w:hint="eastAsia" w:ascii="宋体" w:hAnsi="宋体" w:eastAsia="宋体"/>
         </w:rPr>
         <w:t>，要求说明改设计模式</w:t>
       </w:r>
       <w:r>
         <w:rPr>
-          <w:rFonts w:hint="eastAsia"/>
+          <w:rFonts w:hint="eastAsia" w:ascii="宋体" w:hAnsi="宋体" w:eastAsia="宋体"/>
         </w:rPr>
         <w:t>在此项目中</w:t>
       </w:r>
       <w:r>
         <w:rPr>
-          <w:rFonts w:hint="eastAsia"/>
+          <w:rFonts w:hint="eastAsia" w:ascii="宋体" w:hAnsi="宋体" w:eastAsia="宋体"/>
         </w:rPr>
         <w:t>应用的目的或效果</w:t>
       </w:r>
       <w:r>
         <w:rPr>
-          <w:rFonts w:hint="eastAsia"/>
+          <w:rFonts w:hint="eastAsia" w:ascii="宋体" w:hAnsi="宋体" w:eastAsia="宋体"/>
         </w:rPr>
         <w:t>。</w:t>
       </w:r>
@@ -743,20 +640,21 @@
       </w:pPr>
       <w:r>
         <w:rPr>
-          <w:rFonts w:hint="eastAsia"/>
+          <w:rFonts w:hint="eastAsia" w:ascii="宋体" w:hAnsi="宋体" w:eastAsia="宋体"/>
           <w:b/>
         </w:rPr>
         <w:t>2.</w:t>
       </w:r>
       <w:r>
         <w:rPr>
-          <w:rFonts w:hint="eastAsia"/>
+          <w:rFonts w:hint="eastAsia" w:ascii="宋体" w:hAnsi="宋体" w:eastAsia="宋体"/>
           <w:b/>
         </w:rPr>
         <w:t>解答报告</w:t>
       </w:r>
       <w:r>
         <w:rPr>
+          <w:rFonts w:ascii="宋体" w:hAnsi="宋体" w:eastAsia="宋体"/>
           <w:b/>
         </w:rPr>
         <w:t>正文</w:t>
@@ -764,167 +662,2572 @@
     </w:p>
     <w:p>
       <w:pPr>
-        <w:rPr>
-          <w:rFonts w:hint="eastAsia"/>
-          <w:bCs/>
-        </w:rPr>
-      </w:pPr>
-      <w:r>
-        <w:rPr>
-          <w:rFonts w:hint="eastAsia"/>
-          <w:bCs/>
-        </w:rPr>
-        <w:t>（</w:t>
-      </w:r>
-      <w:r>
-        <w:rPr>
-          <w:rFonts w:hint="eastAsia"/>
-          <w:bCs/>
-        </w:rPr>
-        <w:t>1</w:t>
-      </w:r>
-      <w:r>
-        <w:rPr>
-          <w:rFonts w:hint="eastAsia"/>
-          <w:bCs/>
-        </w:rPr>
-        <w:t>）</w:t>
-      </w:r>
-      <w:r>
-        <w:rPr>
-          <w:rFonts w:hint="eastAsia"/>
-          <w:bCs/>
-        </w:rPr>
-        <w:t>使用了</w:t>
-      </w:r>
-      <w:r>
-        <w:rPr>
-          <w:rFonts w:hint="eastAsia"/>
-          <w:bCs/>
-        </w:rPr>
-        <w:t xml:space="preserve">XX </w:t>
-      </w:r>
-      <w:r>
-        <w:rPr>
-          <w:rFonts w:hint="eastAsia"/>
-          <w:bCs/>
-        </w:rPr>
-        <w:t>设计模式，体现在</w:t>
-      </w:r>
-      <w:r>
-        <w:rPr>
-          <w:rFonts w:hint="eastAsia"/>
-          <w:bCs/>
-        </w:rPr>
-        <w:t xml:space="preserve"> </w:t>
-      </w:r>
-      <w:r>
-        <w:rPr>
-          <w:rFonts w:hint="eastAsia"/>
-          <w:bCs/>
-        </w:rPr>
-        <w:t xml:space="preserve">X </w:t>
-      </w:r>
-      <w:proofErr w:type="spellStart"/>
-      <w:r>
-        <w:rPr>
-          <w:rFonts w:hint="eastAsia"/>
-          <w:bCs/>
-        </w:rPr>
-        <w:t>X</w:t>
-      </w:r>
-      <w:proofErr w:type="spellEnd"/>
-      <w:r>
-        <w:rPr>
-          <w:rFonts w:hint="eastAsia"/>
-          <w:bCs/>
-        </w:rPr>
-        <w:t>类</w:t>
-      </w:r>
-      <w:r>
-        <w:rPr>
-          <w:rFonts w:hint="eastAsia"/>
-          <w:bCs/>
-        </w:rPr>
-        <w:t xml:space="preserve">     </w:t>
-      </w:r>
-      <w:r>
-        <w:rPr>
-          <w:rFonts w:hint="eastAsia"/>
-          <w:bCs/>
-        </w:rPr>
-        <w:t>之间，如下类图所示</w:t>
-      </w:r>
-      <w:r>
-        <w:rPr>
-          <w:rFonts w:hint="eastAsia"/>
-          <w:bCs/>
-        </w:rPr>
-        <w:t>，改设计模式在此项目中的作用是</w:t>
-      </w:r>
-      <w:r>
-        <w:rPr>
-          <w:rFonts w:hint="eastAsia"/>
-          <w:bCs/>
-        </w:rPr>
-        <w:t>:</w:t>
-      </w:r>
-    </w:p>
-    <w:p>
-      <w:pPr>
-        <w:rPr>
-          <w:b/>
-        </w:rPr>
-      </w:pPr>
-    </w:p>
-    <w:p>
-      <w:pPr>
-        <w:rPr>
-          <w:b/>
-        </w:rPr>
-      </w:pPr>
-    </w:p>
-    <w:p>
-      <w:pPr>
-        <w:rPr>
-          <w:b/>
-        </w:rPr>
-      </w:pPr>
-    </w:p>
-    <w:p>
-      <w:pPr>
-        <w:rPr>
-          <w:bCs/>
-        </w:rPr>
-      </w:pPr>
-      <w:r>
-        <w:rPr>
-          <w:rFonts w:hint="eastAsia"/>
-          <w:bCs/>
-        </w:rPr>
-        <w:t>(2)</w:t>
-      </w:r>
-    </w:p>
-    <w:p>
-      <w:pPr>
-        <w:rPr>
-          <w:bCs/>
-        </w:rPr>
-      </w:pPr>
-    </w:p>
-    <w:p>
-      <w:pPr>
-        <w:rPr>
-          <w:rFonts w:hint="eastAsia"/>
-          <w:bCs/>
-        </w:rPr>
-      </w:pPr>
-      <w:r>
-        <w:rPr>
-          <w:rFonts w:hint="eastAsia"/>
-          <w:bCs/>
-        </w:rPr>
-        <w:t xml:space="preserve">(3) </w:t>
+        <w:spacing w:before="200" w:after="120"/>
+      </w:pPr>
+      <w:r>
+        <w:rPr>
+          <w:rFonts w:ascii="宋体" w:hAnsi="宋体" w:eastAsia="宋体"/>
+          <w:b/>
+          <w:sz w:val="28"/>
+        </w:rPr>
+        <w:t>2.1 实验过程</w:t>
+      </w:r>
+    </w:p>
+    <w:p>
+      <w:pPr>
+        <w:spacing w:line="360" w:lineRule="auto"/>
+      </w:pPr>
+      <w:r>
+        <w:rPr>
+          <w:rFonts w:ascii="宋体" w:hAnsi="宋体" w:eastAsia="宋体"/>
+          <w:sz w:val="22"/>
+        </w:rPr>
+        <w:t>本次作业不是直接背诵设计模式定义，而是围绕给定 CADFramework 源码进行逆向分析。分析步骤如下：</w:t>
+      </w:r>
+    </w:p>
+    <w:p>
+      <w:pPr>
+        <w:spacing w:line="360" w:lineRule="auto"/>
+        <w:ind w:left="360" w:hanging="200"/>
+      </w:pPr>
+      <w:r>
+        <w:rPr>
+          <w:rFonts w:ascii="宋体" w:hAnsi="宋体" w:eastAsia="宋体"/>
+          <w:sz w:val="22"/>
+        </w:rPr>
+        <w:t>• 先阅读“CADFramework项目代码结构.txt”，明确项目分为 GeometryKernel、Presentation、Bridge、Demo 四层。</w:t>
+      </w:r>
+    </w:p>
+    <w:p>
+      <w:pPr>
+        <w:spacing w:line="360" w:lineRule="auto"/>
+        <w:ind w:left="360" w:hanging="200"/>
+      </w:pPr>
+      <w:r>
+        <w:rPr>
+          <w:rFonts w:ascii="宋体" w:hAnsi="宋体" w:eastAsia="宋体"/>
+          <w:sz w:val="22"/>
+        </w:rPr>
+        <w:t>• 再从 Demo/Program.cs 的演示入口出发，跟踪视图、控制器、事件、命令和渲染器之间的协作关系。</w:t>
+      </w:r>
+    </w:p>
+    <w:p>
+      <w:pPr>
+        <w:spacing w:line="360" w:lineRule="auto"/>
+        <w:ind w:left="360" w:hanging="200"/>
+      </w:pPr>
+      <w:r>
+        <w:rPr>
+          <w:rFonts w:ascii="宋体" w:hAnsi="宋体" w:eastAsia="宋体"/>
+          <w:sz w:val="22"/>
+        </w:rPr>
+        <w:t>• 对接口、具体实现类、事件订阅关系、组合关系进行归类，识别命令、观察者、策略、桥接四种核心模式。</w:t>
+      </w:r>
+    </w:p>
+    <w:p>
+      <w:pPr>
+        <w:spacing w:line="360" w:lineRule="auto"/>
+        <w:ind w:left="360" w:hanging="200"/>
+      </w:pPr>
+      <w:r>
+        <w:rPr>
+          <w:rFonts w:ascii="宋体" w:hAnsi="宋体" w:eastAsia="宋体"/>
+          <w:sz w:val="22"/>
+        </w:rPr>
+        <w:t>• 继续向事件中心追踪，额外识别出 GeometryEventPublisher 采用了单例模式，从而补足框架中的典型设计模式集合。</w:t>
+      </w:r>
+    </w:p>
+    <w:p>
+      <w:pPr>
+        <w:spacing w:line="360" w:lineRule="auto"/>
+        <w:ind w:left="360" w:hanging="200"/>
+      </w:pPr>
+      <w:r>
+        <w:rPr>
+          <w:rFonts w:ascii="宋体" w:hAnsi="宋体" w:eastAsia="宋体"/>
+          <w:sz w:val="22"/>
+        </w:rPr>
+        <w:t>• 最后为每种模式分别绘制 UML 类图，并整理“类名—模式角色—源码文件路径”对照表，形成可复核的课程作业报告。</w:t>
+      </w:r>
+    </w:p>
+    <w:p>
+      <w:pPr>
+        <w:spacing w:before="200" w:after="120"/>
+      </w:pPr>
+      <w:r>
+        <w:rPr>
+          <w:rFonts w:ascii="宋体" w:hAnsi="宋体" w:eastAsia="宋体"/>
+          <w:b/>
+          <w:sz w:val="28"/>
+        </w:rPr>
+        <w:t>2.2 项目结构概览</w:t>
+      </w:r>
+    </w:p>
+    <w:p>
+      <w:pPr>
+        <w:spacing w:line="360" w:lineRule="auto"/>
+      </w:pPr>
+      <w:r>
+        <w:rPr>
+          <w:rFonts w:ascii="宋体" w:hAnsi="宋体" w:eastAsia="宋体"/>
+          <w:sz w:val="22"/>
+        </w:rPr>
+        <w:t>CADFramework 的整体思路是：GeometryKernel 负责纯几何对象与运算，Presentation 负责渲染与交互，Bridge 层负责事件同步、选择管理和命令调度，Demo 则演示各组件如何组合运行。该结构天然适合从“解耦”和“可扩展”的角度分析设计模式。</w:t>
+      </w:r>
+    </w:p>
+    <w:p>
+      <w:pPr>
+        <w:spacing w:before="200" w:after="120"/>
+      </w:pPr>
+      <w:r>
+        <w:rPr>
+          <w:rFonts w:ascii="宋体" w:hAnsi="宋体" w:eastAsia="宋体"/>
+          <w:b/>
+          <w:sz w:val="28"/>
+        </w:rPr>
+        <w:t>2.3 命令模式（Command）</w:t>
+      </w:r>
+    </w:p>
+    <w:p>
+      <w:pPr>
+        <w:spacing w:line="360" w:lineRule="auto"/>
+      </w:pPr>
+      <w:r>
+        <w:rPr>
+          <w:rFonts w:ascii="宋体" w:hAnsi="宋体" w:eastAsia="宋体"/>
+          <w:sz w:val="22"/>
+        </w:rPr>
+        <w:t>模式定位：该模式在项目中的出现不是孤立的，而是直接服务于 CAD 框架“可扩展、可替换、可联动”的工程目标。</w:t>
+      </w:r>
+    </w:p>
+    <w:p>
+      <w:pPr>
+        <w:spacing w:line="360" w:lineRule="auto"/>
+      </w:pPr>
+      <w:r>
+        <w:rPr>
+          <w:rFonts w:ascii="宋体" w:hAnsi="宋体" w:eastAsia="宋体"/>
+          <w:b/>
+          <w:sz w:val="22"/>
+        </w:rPr>
+        <w:t>设计目的：</w:t>
+      </w:r>
+      <w:r>
+        <w:rPr>
+          <w:rFonts w:ascii="宋体" w:hAnsi="宋体" w:eastAsia="宋体"/>
+          <w:sz w:val="22"/>
+        </w:rPr>
+        <w:t>命令模式把“请求发起者”和“具体执行逻辑”分离，使界面操作可以被统一封装成对象，从而支持撤销、重做和命令队列管理。</w:t>
+      </w:r>
+    </w:p>
+    <w:p>
+      <w:pPr>
+        <w:spacing w:line="360" w:lineRule="auto"/>
+      </w:pPr>
+      <w:r>
+        <w:rPr>
+          <w:rFonts w:ascii="宋体" w:hAnsi="宋体" w:eastAsia="宋体"/>
+          <w:b/>
+          <w:sz w:val="22"/>
+        </w:rPr>
+        <w:t>项目落地效果：</w:t>
+      </w:r>
+      <w:r>
+        <w:rPr>
+          <w:rFonts w:ascii="宋体" w:hAnsi="宋体" w:eastAsia="宋体"/>
+          <w:sz w:val="22"/>
+        </w:rPr>
+        <w:t>本项目把拖拽移动、创建图形等操作都包装为命令对象，再由命令处理器统一调度，因此 CAD 交互不仅能执行动作，还能稳定地实现撤销/重做。</w:t>
+      </w:r>
+    </w:p>
+    <w:p>
+      <w:pPr>
+        <w:spacing w:line="360" w:lineRule="auto"/>
+      </w:pPr>
+      <w:r>
+        <w:rPr>
+          <w:rFonts w:ascii="宋体" w:hAnsi="宋体" w:eastAsia="宋体"/>
+          <w:b/>
+          <w:sz w:val="22"/>
+        </w:rPr>
+        <w:t>标准角色拆解：</w:t>
+      </w:r>
+      <w:r>
+        <w:rPr>
+          <w:rFonts w:ascii="宋体" w:hAnsi="宋体" w:eastAsia="宋体"/>
+          <w:sz w:val="22"/>
+        </w:rPr>
+      </w:r>
+    </w:p>
+    <w:p>
+      <w:pPr>
+        <w:spacing w:line="360" w:lineRule="auto"/>
+        <w:ind w:left="360" w:hanging="200"/>
+      </w:pPr>
+      <w:r>
+        <w:rPr>
+          <w:rFonts w:ascii="宋体" w:hAnsi="宋体" w:eastAsia="宋体"/>
+          <w:sz w:val="22"/>
+        </w:rPr>
+        <w:t>• Client 由 CADView 和 DrawController 承担：前者在拖拽时创建 MoveShapeCommand，后者在绘线、绘矩形、绘圆时创建 CreateShapeCommand。</w:t>
+      </w:r>
+    </w:p>
+    <w:p>
+      <w:pPr>
+        <w:spacing w:line="360" w:lineRule="auto"/>
+        <w:ind w:left="360" w:hanging="200"/>
+      </w:pPr>
+      <w:r>
+        <w:rPr>
+          <w:rFonts w:ascii="宋体" w:hAnsi="宋体" w:eastAsia="宋体"/>
+          <w:sz w:val="22"/>
+        </w:rPr>
+        <w:t>• Invoker 是 CommandProcessor，它负责 ExecuteCommand、Undo、Redo，并维护撤销栈与重做栈。</w:t>
+      </w:r>
+    </w:p>
+    <w:p>
+      <w:pPr>
+        <w:spacing w:line="360" w:lineRule="auto"/>
+        <w:ind w:left="360" w:hanging="200"/>
+      </w:pPr>
+      <w:r>
+        <w:rPr>
+          <w:rFonts w:ascii="宋体" w:hAnsi="宋体" w:eastAsia="宋体"/>
+          <w:sz w:val="22"/>
+        </w:rPr>
+        <w:t>• Command 是 ICommand 接口，统一约束 Execute、Undo 和 Description。</w:t>
+      </w:r>
+    </w:p>
+    <w:p>
+      <w:pPr>
+        <w:spacing w:line="360" w:lineRule="auto"/>
+        <w:ind w:left="360" w:hanging="200"/>
+      </w:pPr>
+      <w:r>
+        <w:rPr>
+          <w:rFonts w:ascii="宋体" w:hAnsi="宋体" w:eastAsia="宋体"/>
+          <w:sz w:val="22"/>
+        </w:rPr>
+        <w:t>• ConcreteCommand 是 CreateShapeCommand 与 MoveShapeCommand，分别封装“创建图元”和“移动图元”两类行为。</w:t>
+      </w:r>
+    </w:p>
+    <w:p>
+      <w:pPr>
+        <w:spacing w:line="360" w:lineRule="auto"/>
+        <w:ind w:left="360" w:hanging="200"/>
+      </w:pPr>
+      <w:r>
+        <w:rPr>
+          <w:rFonts w:ascii="宋体" w:hAnsi="宋体" w:eastAsia="宋体"/>
+          <w:sz w:val="22"/>
+        </w:rPr>
+        <w:t>• Receiver 分别是被修改的图元集合 List&lt;IShape&gt; 与具体图元 IShape / Rectangle，它们是真正被命令操作的对象。</w:t>
+      </w:r>
+    </w:p>
+    <w:p>
+      <w:r>
+        <w:drawing>
+          <wp:inline xmlns:a="http://schemas.openxmlformats.org/drawingml/2006/main" xmlns:pic="http://schemas.openxmlformats.org/drawingml/2006/picture">
+            <wp:extent cx="6126480" cy="3829050"/>
+            <wp:docPr id="1" name="Picture 1"/>
+            <wp:cNvGraphicFramePr>
+              <a:graphicFrameLocks noChangeAspect="1"/>
+            </wp:cNvGraphicFramePr>
+            <a:graphic>
+              <a:graphicData uri="http://schemas.openxmlformats.org/drawingml/2006/picture">
+                <pic:pic>
+                  <pic:nvPicPr>
+                    <pic:cNvPr id="0" name="command.png"/>
+                    <pic:cNvPicPr/>
+                  </pic:nvPicPr>
+                  <pic:blipFill>
+                    <a:blip r:embed="rId14"/>
+                    <a:stretch>
+                      <a:fillRect/>
+                    </a:stretch>
+                  </pic:blipFill>
+                  <pic:spPr>
+                    <a:xfrm>
+                      <a:off x="0" y="0"/>
+                      <a:ext cx="6126480" cy="3829050"/>
+                    </a:xfrm>
+                    <a:prstGeom prst="rect"/>
+                  </pic:spPr>
+                </pic:pic>
+              </a:graphicData>
+            </a:graphic>
+          </wp:inline>
+        </w:drawing>
+      </w:r>
+    </w:p>
+    <w:p>
+      <w:pPr>
+        <w:jc w:val="center"/>
+      </w:pPr>
+      <w:r>
+        <w:rPr>
+          <w:rFonts w:ascii="宋体" w:hAnsi="宋体" w:eastAsia="宋体"/>
+          <w:i/>
+          <w:sz w:val="21"/>
+        </w:rPr>
+        <w:t>图3 命令模式（Command） UML类图</w:t>
+      </w:r>
+    </w:p>
+    <w:p>
+      <w:pPr>
+        <w:spacing w:line="360" w:lineRule="auto"/>
+      </w:pPr>
+      <w:r>
+        <w:rPr>
+          <w:rFonts w:ascii="宋体" w:hAnsi="宋体" w:eastAsia="宋体"/>
+          <w:b/>
+          <w:sz w:val="22"/>
+        </w:rPr>
+        <w:t>源码角色对照表：</w:t>
+      </w:r>
+      <w:r>
+        <w:rPr>
+          <w:rFonts w:ascii="宋体" w:hAnsi="宋体" w:eastAsia="宋体"/>
+          <w:sz w:val="22"/>
+        </w:rPr>
+      </w:r>
+    </w:p>
+    <w:tbl>
+      <w:tblPr>
+        <w:tblW w:type="auto" w:w="0"/>
+        <w:tblLook w:firstColumn="1" w:firstRow="1" w:lastColumn="0" w:lastRow="0" w:noHBand="0" w:noVBand="1" w:val="04A0"/>
+      </w:tblPr>
+      <w:tblGrid>
+        <w:gridCol w:w="2769"/>
+        <w:gridCol w:w="2769"/>
+        <w:gridCol w:w="2769"/>
+      </w:tblGrid>
+      <w:tr>
+        <w:tc>
+          <w:tcPr>
+            <w:tcW w:type="dxa" w:w="2769"/>
+          </w:tcPr>
+          <w:p>
+            <w:r>
+              <w:rPr>
+                <w:sz w:val="21"/>
+              </w:rPr>
+              <w:t>类名</w:t>
+            </w:r>
+          </w:p>
+        </w:tc>
+        <w:tc>
+          <w:tcPr>
+            <w:tcW w:type="dxa" w:w="2769"/>
+          </w:tcPr>
+          <w:p>
+            <w:r>
+              <w:rPr>
+                <w:sz w:val="21"/>
+              </w:rPr>
+              <w:t>模式角色</w:t>
+            </w:r>
+          </w:p>
+        </w:tc>
+        <w:tc>
+          <w:tcPr>
+            <w:tcW w:type="dxa" w:w="2769"/>
+          </w:tcPr>
+          <w:p>
+            <w:r>
+              <w:rPr>
+                <w:sz w:val="21"/>
+              </w:rPr>
+              <w:t>源码文件路径</w:t>
+            </w:r>
+          </w:p>
+        </w:tc>
+      </w:tr>
+      <w:tr>
+        <w:tc>
+          <w:tcPr>
+            <w:tcW w:type="dxa" w:w="2769"/>
+          </w:tcPr>
+          <w:p>
+            <w:r>
+              <w:rPr>
+                <w:sz w:val="21"/>
+              </w:rPr>
+              <w:t>CADView</w:t>
+            </w:r>
+          </w:p>
+        </w:tc>
+        <w:tc>
+          <w:tcPr>
+            <w:tcW w:type="dxa" w:w="2769"/>
+          </w:tcPr>
+          <w:p>
+            <w:r>
+              <w:rPr>
+                <w:sz w:val="21"/>
+              </w:rPr>
+              <w:t>Client</w:t>
+            </w:r>
+          </w:p>
+        </w:tc>
+        <w:tc>
+          <w:tcPr>
+            <w:tcW w:type="dxa" w:w="2769"/>
+          </w:tcPr>
+          <w:p>
+            <w:r>
+              <w:rPr>
+                <w:sz w:val="21"/>
+              </w:rPr>
+              <w:t>作业2/三维CAD软件设计中单一职责原则的使用/CADFramework/Presentation/Views/CADView.cs</w:t>
+            </w:r>
+          </w:p>
+        </w:tc>
+      </w:tr>
+      <w:tr>
+        <w:tc>
+          <w:tcPr>
+            <w:tcW w:type="dxa" w:w="2769"/>
+          </w:tcPr>
+          <w:p>
+            <w:r>
+              <w:rPr>
+                <w:sz w:val="21"/>
+              </w:rPr>
+              <w:t>DrawController</w:t>
+            </w:r>
+          </w:p>
+        </w:tc>
+        <w:tc>
+          <w:tcPr>
+            <w:tcW w:type="dxa" w:w="2769"/>
+          </w:tcPr>
+          <w:p>
+            <w:r>
+              <w:rPr>
+                <w:sz w:val="21"/>
+              </w:rPr>
+              <w:t>Client</w:t>
+            </w:r>
+          </w:p>
+        </w:tc>
+        <w:tc>
+          <w:tcPr>
+            <w:tcW w:type="dxa" w:w="2769"/>
+          </w:tcPr>
+          <w:p>
+            <w:r>
+              <w:rPr>
+                <w:sz w:val="21"/>
+              </w:rPr>
+              <w:t>作业2/三维CAD软件设计中单一职责原则的使用/CADFramework/Presentation/Controllers/DrawController.cs</w:t>
+            </w:r>
+          </w:p>
+        </w:tc>
+      </w:tr>
+      <w:tr>
+        <w:tc>
+          <w:tcPr>
+            <w:tcW w:type="dxa" w:w="2769"/>
+          </w:tcPr>
+          <w:p>
+            <w:r>
+              <w:rPr>
+                <w:sz w:val="21"/>
+              </w:rPr>
+              <w:t>CommandProcessor</w:t>
+            </w:r>
+          </w:p>
+        </w:tc>
+        <w:tc>
+          <w:tcPr>
+            <w:tcW w:type="dxa" w:w="2769"/>
+          </w:tcPr>
+          <w:p>
+            <w:r>
+              <w:rPr>
+                <w:sz w:val="21"/>
+              </w:rPr>
+              <w:t>Invoker</w:t>
+            </w:r>
+          </w:p>
+        </w:tc>
+        <w:tc>
+          <w:tcPr>
+            <w:tcW w:type="dxa" w:w="2769"/>
+          </w:tcPr>
+          <w:p>
+            <w:r>
+              <w:rPr>
+                <w:sz w:val="21"/>
+              </w:rPr>
+              <w:t>作业2/三维CAD软件设计中单一职责原则的使用/CADFramework/Bridge/CommandProcessor.cs</w:t>
+            </w:r>
+          </w:p>
+        </w:tc>
+      </w:tr>
+      <w:tr>
+        <w:tc>
+          <w:tcPr>
+            <w:tcW w:type="dxa" w:w="2769"/>
+          </w:tcPr>
+          <w:p>
+            <w:r>
+              <w:rPr>
+                <w:sz w:val="21"/>
+              </w:rPr>
+              <w:t>ICommand</w:t>
+            </w:r>
+          </w:p>
+        </w:tc>
+        <w:tc>
+          <w:tcPr>
+            <w:tcW w:type="dxa" w:w="2769"/>
+          </w:tcPr>
+          <w:p>
+            <w:r>
+              <w:rPr>
+                <w:sz w:val="21"/>
+              </w:rPr>
+              <w:t>Command</w:t>
+            </w:r>
+          </w:p>
+        </w:tc>
+        <w:tc>
+          <w:tcPr>
+            <w:tcW w:type="dxa" w:w="2769"/>
+          </w:tcPr>
+          <w:p>
+            <w:r>
+              <w:rPr>
+                <w:sz w:val="21"/>
+              </w:rPr>
+              <w:t>作业2/三维CAD软件设计中单一职责原则的使用/CADFramework/Bridge/CommandProcessor.cs</w:t>
+            </w:r>
+          </w:p>
+        </w:tc>
+      </w:tr>
+      <w:tr>
+        <w:tc>
+          <w:tcPr>
+            <w:tcW w:type="dxa" w:w="2769"/>
+          </w:tcPr>
+          <w:p>
+            <w:r>
+              <w:rPr>
+                <w:sz w:val="21"/>
+              </w:rPr>
+              <w:t>CreateShapeCommand</w:t>
+            </w:r>
+          </w:p>
+        </w:tc>
+        <w:tc>
+          <w:tcPr>
+            <w:tcW w:type="dxa" w:w="2769"/>
+          </w:tcPr>
+          <w:p>
+            <w:r>
+              <w:rPr>
+                <w:sz w:val="21"/>
+              </w:rPr>
+              <w:t>ConcreteCommand</w:t>
+            </w:r>
+          </w:p>
+        </w:tc>
+        <w:tc>
+          <w:tcPr>
+            <w:tcW w:type="dxa" w:w="2769"/>
+          </w:tcPr>
+          <w:p>
+            <w:r>
+              <w:rPr>
+                <w:sz w:val="21"/>
+              </w:rPr>
+              <w:t>作业2/三维CAD软件设计中单一职责原则的使用/CADFramework/Bridge/CommandProcessor.cs</w:t>
+            </w:r>
+          </w:p>
+        </w:tc>
+      </w:tr>
+      <w:tr>
+        <w:tc>
+          <w:tcPr>
+            <w:tcW w:type="dxa" w:w="2769"/>
+          </w:tcPr>
+          <w:p>
+            <w:r>
+              <w:rPr>
+                <w:sz w:val="21"/>
+              </w:rPr>
+              <w:t>MoveShapeCommand</w:t>
+            </w:r>
+          </w:p>
+        </w:tc>
+        <w:tc>
+          <w:tcPr>
+            <w:tcW w:type="dxa" w:w="2769"/>
+          </w:tcPr>
+          <w:p>
+            <w:r>
+              <w:rPr>
+                <w:sz w:val="21"/>
+              </w:rPr>
+              <w:t>ConcreteCommand</w:t>
+            </w:r>
+          </w:p>
+        </w:tc>
+        <w:tc>
+          <w:tcPr>
+            <w:tcW w:type="dxa" w:w="2769"/>
+          </w:tcPr>
+          <w:p>
+            <w:r>
+              <w:rPr>
+                <w:sz w:val="21"/>
+              </w:rPr>
+              <w:t>作业2/三维CAD软件设计中单一职责原则的使用/CADFramework/Bridge/CommandProcessor.cs</w:t>
+            </w:r>
+          </w:p>
+        </w:tc>
+      </w:tr>
+      <w:tr>
+        <w:tc>
+          <w:tcPr>
+            <w:tcW w:type="dxa" w:w="2769"/>
+          </w:tcPr>
+          <w:p>
+            <w:r>
+              <w:rPr>
+                <w:sz w:val="21"/>
+              </w:rPr>
+              <w:t>List&lt;IShape&gt; / IShape</w:t>
+            </w:r>
+          </w:p>
+        </w:tc>
+        <w:tc>
+          <w:tcPr>
+            <w:tcW w:type="dxa" w:w="2769"/>
+          </w:tcPr>
+          <w:p>
+            <w:r>
+              <w:rPr>
+                <w:sz w:val="21"/>
+              </w:rPr>
+              <w:t>Receiver</w:t>
+            </w:r>
+          </w:p>
+        </w:tc>
+        <w:tc>
+          <w:tcPr>
+            <w:tcW w:type="dxa" w:w="2769"/>
+          </w:tcPr>
+          <w:p>
+            <w:r>
+              <w:rPr>
+                <w:sz w:val="21"/>
+              </w:rPr>
+              <w:t>作业2/三维CAD软件设计中单一职责原则的使用/CADFramework/Bridge/CommandProcessor.cs；作业2/三维CAD软件设计中单一职责原则的使用/CADFramework/GeometryKernel/Primitives/IShape.cs</w:t>
+            </w:r>
+          </w:p>
+        </w:tc>
+      </w:tr>
+    </w:tbl>
+    <w:p/>
+    <w:p>
+      <w:pPr>
+        <w:spacing w:before="200" w:after="120"/>
+      </w:pPr>
+      <w:r>
+        <w:rPr>
+          <w:rFonts w:ascii="宋体" w:hAnsi="宋体" w:eastAsia="宋体"/>
+          <w:b/>
+          <w:sz w:val="28"/>
+        </w:rPr>
+        <w:t>2.4 观察者模式（Observer）</w:t>
+      </w:r>
+    </w:p>
+    <w:p>
+      <w:pPr>
+        <w:spacing w:line="360" w:lineRule="auto"/>
+      </w:pPr>
+      <w:r>
+        <w:rPr>
+          <w:rFonts w:ascii="宋体" w:hAnsi="宋体" w:eastAsia="宋体"/>
+          <w:sz w:val="22"/>
+        </w:rPr>
+        <w:t>模式定位：该模式在项目中的出现不是孤立的，而是直接服务于 CAD 框架“可扩展、可替换、可联动”的工程目标。</w:t>
+      </w:r>
+    </w:p>
+    <w:p>
+      <w:pPr>
+        <w:spacing w:line="360" w:lineRule="auto"/>
+      </w:pPr>
+      <w:r>
+        <w:rPr>
+          <w:rFonts w:ascii="宋体" w:hAnsi="宋体" w:eastAsia="宋体"/>
+          <w:b/>
+          <w:sz w:val="22"/>
+        </w:rPr>
+        <w:t>设计目的：</w:t>
+      </w:r>
+      <w:r>
+        <w:rPr>
+          <w:rFonts w:ascii="宋体" w:hAnsi="宋体" w:eastAsia="宋体"/>
+          <w:sz w:val="22"/>
+        </w:rPr>
+        <w:t>观察者模式用于建立“一处状态变化、多处自动感知”的松耦合通知机制，让几何内核只负责发事件，不直接依赖界面层。</w:t>
+      </w:r>
+    </w:p>
+    <w:p>
+      <w:pPr>
+        <w:spacing w:line="360" w:lineRule="auto"/>
+      </w:pPr>
+      <w:r>
+        <w:rPr>
+          <w:rFonts w:ascii="宋体" w:hAnsi="宋体" w:eastAsia="宋体"/>
+          <w:b/>
+          <w:sz w:val="22"/>
+        </w:rPr>
+        <w:t>项目落地效果：</w:t>
+      </w:r>
+      <w:r>
+        <w:rPr>
+          <w:rFonts w:ascii="宋体" w:hAnsi="宋体" w:eastAsia="宋体"/>
+          <w:sz w:val="22"/>
+        </w:rPr>
+        <w:t>本项目中 GeometryEventPublisher 统一发布几何变化，GeometryObserver 订阅后同步内部图元快照，再由 CADView 读取结果刷新显示，形成了“几何内核 -&gt; 事件 -&gt; 桥接层 -&gt; 视图层”的解耦链路。</w:t>
+      </w:r>
+    </w:p>
+    <w:p>
+      <w:pPr>
+        <w:spacing w:line="360" w:lineRule="auto"/>
+      </w:pPr>
+      <w:r>
+        <w:rPr>
+          <w:rFonts w:ascii="宋体" w:hAnsi="宋体" w:eastAsia="宋体"/>
+          <w:b/>
+          <w:sz w:val="22"/>
+        </w:rPr>
+        <w:t>标准角色拆解：</w:t>
+      </w:r>
+      <w:r>
+        <w:rPr>
+          <w:rFonts w:ascii="宋体" w:hAnsi="宋体" w:eastAsia="宋体"/>
+          <w:sz w:val="22"/>
+        </w:rPr>
+      </w:r>
+    </w:p>
+    <w:p>
+      <w:pPr>
+        <w:spacing w:line="360" w:lineRule="auto"/>
+        <w:ind w:left="360" w:hanging="200"/>
+      </w:pPr>
+      <w:r>
+        <w:rPr>
+          <w:rFonts w:ascii="宋体" w:hAnsi="宋体" w:eastAsia="宋体"/>
+          <w:sz w:val="22"/>
+        </w:rPr>
+        <w:t>• Subject 是 GeometryEventPublisher，它公开 GeometryChanged 事件，并通过 Publish 方法向外广播几何变化。</w:t>
+      </w:r>
+    </w:p>
+    <w:p>
+      <w:pPr>
+        <w:spacing w:line="360" w:lineRule="auto"/>
+        <w:ind w:left="360" w:hanging="200"/>
+      </w:pPr>
+      <w:r>
+        <w:rPr>
+          <w:rFonts w:ascii="宋体" w:hAnsi="宋体" w:eastAsia="宋体"/>
+          <w:sz w:val="22"/>
+        </w:rPr>
+        <w:t>• ConcreteObserver 是 GeometryObserver，它在构造函数中订阅 GeometryChanged，并在 OnGeometryChanged 中根据事件类型更新本地缓存。</w:t>
+      </w:r>
+    </w:p>
+    <w:p>
+      <w:pPr>
+        <w:spacing w:line="360" w:lineRule="auto"/>
+        <w:ind w:left="360" w:hanging="200"/>
+      </w:pPr>
+      <w:r>
+        <w:rPr>
+          <w:rFonts w:ascii="宋体" w:hAnsi="宋体" w:eastAsia="宋体"/>
+          <w:sz w:val="22"/>
+        </w:rPr>
+        <w:t>• GeometryEventArgs 是事件参数载体，封装 EventType、ShapeId、ShapeName、ShapeData 与 Timestamp。</w:t>
+      </w:r>
+    </w:p>
+    <w:p>
+      <w:pPr>
+        <w:spacing w:line="360" w:lineRule="auto"/>
+        <w:ind w:left="360" w:hanging="200"/>
+      </w:pPr>
+      <w:r>
+        <w:rPr>
+          <w:rFonts w:ascii="宋体" w:hAnsi="宋体" w:eastAsia="宋体"/>
+          <w:sz w:val="22"/>
+        </w:rPr>
+        <w:t>• DrawController、SelectionManager 等类通过 GeometryEventPublisher.Instance.Publish(...) 触发事件，体现“发布者不需要知道订阅者是谁”。</w:t>
+      </w:r>
+    </w:p>
+    <w:p>
+      <w:pPr>
+        <w:spacing w:line="360" w:lineRule="auto"/>
+        <w:ind w:left="360" w:hanging="200"/>
+      </w:pPr>
+      <w:r>
+        <w:rPr>
+          <w:rFonts w:ascii="宋体" w:hAnsi="宋体" w:eastAsia="宋体"/>
+          <w:sz w:val="22"/>
+        </w:rPr>
+        <w:t>• 项目中还存在 SelectionManager.SelectionChanged 和 CommandProcessor.CommandExecuted 两条事件通知链，进一步强化了观察者式的消息联动。</w:t>
+      </w:r>
+    </w:p>
+    <w:p>
+      <w:r>
+        <w:drawing>
+          <wp:inline xmlns:a="http://schemas.openxmlformats.org/drawingml/2006/main" xmlns:pic="http://schemas.openxmlformats.org/drawingml/2006/picture">
+            <wp:extent cx="6126480" cy="3829050"/>
+            <wp:docPr id="2" name="Picture 2"/>
+            <wp:cNvGraphicFramePr>
+              <a:graphicFrameLocks noChangeAspect="1"/>
+            </wp:cNvGraphicFramePr>
+            <a:graphic>
+              <a:graphicData uri="http://schemas.openxmlformats.org/drawingml/2006/picture">
+                <pic:pic>
+                  <pic:nvPicPr>
+                    <pic:cNvPr id="0" name="observer.png"/>
+                    <pic:cNvPicPr/>
+                  </pic:nvPicPr>
+                  <pic:blipFill>
+                    <a:blip r:embed="rId15"/>
+                    <a:stretch>
+                      <a:fillRect/>
+                    </a:stretch>
+                  </pic:blipFill>
+                  <pic:spPr>
+                    <a:xfrm>
+                      <a:off x="0" y="0"/>
+                      <a:ext cx="6126480" cy="3829050"/>
+                    </a:xfrm>
+                    <a:prstGeom prst="rect"/>
+                  </pic:spPr>
+                </pic:pic>
+              </a:graphicData>
+            </a:graphic>
+          </wp:inline>
+        </w:drawing>
+      </w:r>
+    </w:p>
+    <w:p>
+      <w:pPr>
+        <w:jc w:val="center"/>
+      </w:pPr>
+      <w:r>
+        <w:rPr>
+          <w:rFonts w:ascii="宋体" w:hAnsi="宋体" w:eastAsia="宋体"/>
+          <w:i/>
+          <w:sz w:val="21"/>
+        </w:rPr>
+        <w:t>图4 观察者模式（Observer） UML类图</w:t>
+      </w:r>
+    </w:p>
+    <w:p>
+      <w:pPr>
+        <w:spacing w:line="360" w:lineRule="auto"/>
+      </w:pPr>
+      <w:r>
+        <w:rPr>
+          <w:rFonts w:ascii="宋体" w:hAnsi="宋体" w:eastAsia="宋体"/>
+          <w:b/>
+          <w:sz w:val="22"/>
+        </w:rPr>
+        <w:t>源码角色对照表：</w:t>
+      </w:r>
+      <w:r>
+        <w:rPr>
+          <w:rFonts w:ascii="宋体" w:hAnsi="宋体" w:eastAsia="宋体"/>
+          <w:sz w:val="22"/>
+        </w:rPr>
+      </w:r>
+    </w:p>
+    <w:tbl>
+      <w:tblPr>
+        <w:tblW w:type="auto" w:w="0"/>
+        <w:tblLook w:firstColumn="1" w:firstRow="1" w:lastColumn="0" w:lastRow="0" w:noHBand="0" w:noVBand="1" w:val="04A0"/>
+      </w:tblPr>
+      <w:tblGrid>
+        <w:gridCol w:w="2769"/>
+        <w:gridCol w:w="2769"/>
+        <w:gridCol w:w="2769"/>
+      </w:tblGrid>
+      <w:tr>
+        <w:tc>
+          <w:tcPr>
+            <w:tcW w:type="dxa" w:w="2769"/>
+          </w:tcPr>
+          <w:p>
+            <w:r>
+              <w:rPr>
+                <w:sz w:val="21"/>
+              </w:rPr>
+              <w:t>类名</w:t>
+            </w:r>
+          </w:p>
+        </w:tc>
+        <w:tc>
+          <w:tcPr>
+            <w:tcW w:type="dxa" w:w="2769"/>
+          </w:tcPr>
+          <w:p>
+            <w:r>
+              <w:rPr>
+                <w:sz w:val="21"/>
+              </w:rPr>
+              <w:t>模式角色</w:t>
+            </w:r>
+          </w:p>
+        </w:tc>
+        <w:tc>
+          <w:tcPr>
+            <w:tcW w:type="dxa" w:w="2769"/>
+          </w:tcPr>
+          <w:p>
+            <w:r>
+              <w:rPr>
+                <w:sz w:val="21"/>
+              </w:rPr>
+              <w:t>源码文件路径</w:t>
+            </w:r>
+          </w:p>
+        </w:tc>
+      </w:tr>
+      <w:tr>
+        <w:tc>
+          <w:tcPr>
+            <w:tcW w:type="dxa" w:w="2769"/>
+          </w:tcPr>
+          <w:p>
+            <w:r>
+              <w:rPr>
+                <w:sz w:val="21"/>
+              </w:rPr>
+              <w:t>GeometryEventPublisher</w:t>
+            </w:r>
+          </w:p>
+        </w:tc>
+        <w:tc>
+          <w:tcPr>
+            <w:tcW w:type="dxa" w:w="2769"/>
+          </w:tcPr>
+          <w:p>
+            <w:r>
+              <w:rPr>
+                <w:sz w:val="21"/>
+              </w:rPr>
+              <w:t>Subject / ConcreteSubject</w:t>
+            </w:r>
+          </w:p>
+        </w:tc>
+        <w:tc>
+          <w:tcPr>
+            <w:tcW w:type="dxa" w:w="2769"/>
+          </w:tcPr>
+          <w:p>
+            <w:r>
+              <w:rPr>
+                <w:sz w:val="21"/>
+              </w:rPr>
+              <w:t>作业2/三维CAD软件设计中单一职责原则的使用/CADFramework/GeometryKernel/Events/GeometryEvent.cs</w:t>
+            </w:r>
+          </w:p>
+        </w:tc>
+      </w:tr>
+      <w:tr>
+        <w:tc>
+          <w:tcPr>
+            <w:tcW w:type="dxa" w:w="2769"/>
+          </w:tcPr>
+          <w:p>
+            <w:r>
+              <w:rPr>
+                <w:sz w:val="21"/>
+              </w:rPr>
+              <w:t>GeometryObserver</w:t>
+            </w:r>
+          </w:p>
+        </w:tc>
+        <w:tc>
+          <w:tcPr>
+            <w:tcW w:type="dxa" w:w="2769"/>
+          </w:tcPr>
+          <w:p>
+            <w:r>
+              <w:rPr>
+                <w:sz w:val="21"/>
+              </w:rPr>
+              <w:t>ConcreteObserver</w:t>
+            </w:r>
+          </w:p>
+        </w:tc>
+        <w:tc>
+          <w:tcPr>
+            <w:tcW w:type="dxa" w:w="2769"/>
+          </w:tcPr>
+          <w:p>
+            <w:r>
+              <w:rPr>
+                <w:sz w:val="21"/>
+              </w:rPr>
+              <w:t>作业2/三维CAD软件设计中单一职责原则的使用/CADFramework/Bridge/GeometryObserver.cs</w:t>
+            </w:r>
+          </w:p>
+        </w:tc>
+      </w:tr>
+      <w:tr>
+        <w:tc>
+          <w:tcPr>
+            <w:tcW w:type="dxa" w:w="2769"/>
+          </w:tcPr>
+          <w:p>
+            <w:r>
+              <w:rPr>
+                <w:sz w:val="21"/>
+              </w:rPr>
+              <w:t>GeometryEventArgs</w:t>
+            </w:r>
+          </w:p>
+        </w:tc>
+        <w:tc>
+          <w:tcPr>
+            <w:tcW w:type="dxa" w:w="2769"/>
+          </w:tcPr>
+          <w:p>
+            <w:r>
+              <w:rPr>
+                <w:sz w:val="21"/>
+              </w:rPr>
+              <w:t>事件参数载体</w:t>
+            </w:r>
+          </w:p>
+        </w:tc>
+        <w:tc>
+          <w:tcPr>
+            <w:tcW w:type="dxa" w:w="2769"/>
+          </w:tcPr>
+          <w:p>
+            <w:r>
+              <w:rPr>
+                <w:sz w:val="21"/>
+              </w:rPr>
+              <w:t>作业2/三维CAD软件设计中单一职责原则的使用/CADFramework/GeometryKernel/Events/GeometryEvent.cs</w:t>
+            </w:r>
+          </w:p>
+        </w:tc>
+      </w:tr>
+      <w:tr>
+        <w:tc>
+          <w:tcPr>
+            <w:tcW w:type="dxa" w:w="2769"/>
+          </w:tcPr>
+          <w:p>
+            <w:r>
+              <w:rPr>
+                <w:sz w:val="21"/>
+              </w:rPr>
+              <w:t>DrawController</w:t>
+            </w:r>
+          </w:p>
+        </w:tc>
+        <w:tc>
+          <w:tcPr>
+            <w:tcW w:type="dxa" w:w="2769"/>
+          </w:tcPr>
+          <w:p>
+            <w:r>
+              <w:rPr>
+                <w:sz w:val="21"/>
+              </w:rPr>
+              <w:t>事件触发方</w:t>
+            </w:r>
+          </w:p>
+        </w:tc>
+        <w:tc>
+          <w:tcPr>
+            <w:tcW w:type="dxa" w:w="2769"/>
+          </w:tcPr>
+          <w:p>
+            <w:r>
+              <w:rPr>
+                <w:sz w:val="21"/>
+              </w:rPr>
+              <w:t>作业2/三维CAD软件设计中单一职责原则的使用/CADFramework/Presentation/Controllers/DrawController.cs</w:t>
+            </w:r>
+          </w:p>
+        </w:tc>
+      </w:tr>
+      <w:tr>
+        <w:tc>
+          <w:tcPr>
+            <w:tcW w:type="dxa" w:w="2769"/>
+          </w:tcPr>
+          <w:p>
+            <w:r>
+              <w:rPr>
+                <w:sz w:val="21"/>
+              </w:rPr>
+              <w:t>SelectionManager</w:t>
+            </w:r>
+          </w:p>
+        </w:tc>
+        <w:tc>
+          <w:tcPr>
+            <w:tcW w:type="dxa" w:w="2769"/>
+          </w:tcPr>
+          <w:p>
+            <w:r>
+              <w:rPr>
+                <w:sz w:val="21"/>
+              </w:rPr>
+              <w:t>事件触发方 / 衍生Subject</w:t>
+            </w:r>
+          </w:p>
+        </w:tc>
+        <w:tc>
+          <w:tcPr>
+            <w:tcW w:type="dxa" w:w="2769"/>
+          </w:tcPr>
+          <w:p>
+            <w:r>
+              <w:rPr>
+                <w:sz w:val="21"/>
+              </w:rPr>
+              <w:t>作业2/三维CAD软件设计中单一职责原则的使用/CADFramework/Bridge/SelectionManager.cs</w:t>
+            </w:r>
+          </w:p>
+        </w:tc>
+      </w:tr>
+      <w:tr>
+        <w:tc>
+          <w:tcPr>
+            <w:tcW w:type="dxa" w:w="2769"/>
+          </w:tcPr>
+          <w:p>
+            <w:r>
+              <w:rPr>
+                <w:sz w:val="21"/>
+              </w:rPr>
+              <w:t>CADView</w:t>
+            </w:r>
+          </w:p>
+        </w:tc>
+        <w:tc>
+          <w:tcPr>
+            <w:tcW w:type="dxa" w:w="2769"/>
+          </w:tcPr>
+          <w:p>
+            <w:r>
+              <w:rPr>
+                <w:sz w:val="21"/>
+              </w:rPr>
+              <w:t>观察结果使用方</w:t>
+            </w:r>
+          </w:p>
+        </w:tc>
+        <w:tc>
+          <w:tcPr>
+            <w:tcW w:type="dxa" w:w="2769"/>
+          </w:tcPr>
+          <w:p>
+            <w:r>
+              <w:rPr>
+                <w:sz w:val="21"/>
+              </w:rPr>
+              <w:t>作业2/三维CAD软件设计中单一职责原则的使用/CADFramework/Presentation/Views/CADView.cs</w:t>
+            </w:r>
+          </w:p>
+        </w:tc>
+      </w:tr>
+    </w:tbl>
+    <w:p/>
+    <w:p>
+      <w:pPr>
+        <w:spacing w:before="200" w:after="120"/>
+      </w:pPr>
+      <w:r>
+        <w:rPr>
+          <w:rFonts w:ascii="宋体" w:hAnsi="宋体" w:eastAsia="宋体"/>
+          <w:b/>
+          <w:sz w:val="28"/>
+        </w:rPr>
+        <w:t>2.5 策略模式（Strategy）</w:t>
+      </w:r>
+    </w:p>
+    <w:p>
+      <w:pPr>
+        <w:spacing w:line="360" w:lineRule="auto"/>
+      </w:pPr>
+      <w:r>
+        <w:rPr>
+          <w:rFonts w:ascii="宋体" w:hAnsi="宋体" w:eastAsia="宋体"/>
+          <w:sz w:val="22"/>
+        </w:rPr>
+        <w:t>模式定位：该模式在项目中的出现不是孤立的，而是直接服务于 CAD 框架“可扩展、可替换、可联动”的工程目标。</w:t>
+      </w:r>
+    </w:p>
+    <w:p>
+      <w:pPr>
+        <w:spacing w:line="360" w:lineRule="auto"/>
+      </w:pPr>
+      <w:r>
+        <w:rPr>
+          <w:rFonts w:ascii="宋体" w:hAnsi="宋体" w:eastAsia="宋体"/>
+          <w:b/>
+          <w:sz w:val="22"/>
+        </w:rPr>
+        <w:t>设计目的：</w:t>
+      </w:r>
+      <w:r>
+        <w:rPr>
+          <w:rFonts w:ascii="宋体" w:hAnsi="宋体" w:eastAsia="宋体"/>
+          <w:sz w:val="22"/>
+        </w:rPr>
+        <w:t>策略模式用于把可替换的算法家族抽象成统一接口，使调用方只依赖抽象而不依赖具体实现，运行时可灵活切换算法。</w:t>
+      </w:r>
+    </w:p>
+    <w:p>
+      <w:pPr>
+        <w:spacing w:line="360" w:lineRule="auto"/>
+      </w:pPr>
+      <w:r>
+        <w:rPr>
+          <w:rFonts w:ascii="宋体" w:hAnsi="宋体" w:eastAsia="宋体"/>
+          <w:b/>
+          <w:sz w:val="22"/>
+        </w:rPr>
+        <w:t>项目落地效果：</w:t>
+      </w:r>
+      <w:r>
+        <w:rPr>
+          <w:rFonts w:ascii="宋体" w:hAnsi="宋体" w:eastAsia="宋体"/>
+          <w:sz w:val="22"/>
+        </w:rPr>
+        <w:t>本项目把不同渲染算法抽象为 IRenderer：同一个 CADView 可以在 OpenGLRenderer 与 WireframeRenderer 之间自由切换，界面层代码无需重写即可适应不同显示策略。</w:t>
+      </w:r>
+    </w:p>
+    <w:p>
+      <w:pPr>
+        <w:spacing w:line="360" w:lineRule="auto"/>
+      </w:pPr>
+      <w:r>
+        <w:rPr>
+          <w:rFonts w:ascii="宋体" w:hAnsi="宋体" w:eastAsia="宋体"/>
+          <w:b/>
+          <w:sz w:val="22"/>
+        </w:rPr>
+        <w:t>标准角色拆解：</w:t>
+      </w:r>
+      <w:r>
+        <w:rPr>
+          <w:rFonts w:ascii="宋体" w:hAnsi="宋体" w:eastAsia="宋体"/>
+          <w:sz w:val="22"/>
+        </w:rPr>
+      </w:r>
+    </w:p>
+    <w:p>
+      <w:pPr>
+        <w:spacing w:line="360" w:lineRule="auto"/>
+        <w:ind w:left="360" w:hanging="200"/>
+      </w:pPr>
+      <w:r>
+        <w:rPr>
+          <w:rFonts w:ascii="宋体" w:hAnsi="宋体" w:eastAsia="宋体"/>
+          <w:sz w:val="22"/>
+        </w:rPr>
+        <w:t>• Context 是 CADView，它持有 IRenderer 类型字段，并把初始化、刷新、批量渲染等动作委托给渲染策略。</w:t>
+      </w:r>
+    </w:p>
+    <w:p>
+      <w:pPr>
+        <w:spacing w:line="360" w:lineRule="auto"/>
+        <w:ind w:left="360" w:hanging="200"/>
+      </w:pPr>
+      <w:r>
+        <w:rPr>
+          <w:rFonts w:ascii="宋体" w:hAnsi="宋体" w:eastAsia="宋体"/>
+          <w:sz w:val="22"/>
+        </w:rPr>
+        <w:t>• Strategy 是 IRenderer 接口，它统一定义 Initialize、RenderShape、RenderAllShapes、SetColor 等渲染行为。</w:t>
+      </w:r>
+    </w:p>
+    <w:p>
+      <w:pPr>
+        <w:spacing w:line="360" w:lineRule="auto"/>
+        <w:ind w:left="360" w:hanging="200"/>
+      </w:pPr>
+      <w:r>
+        <w:rPr>
+          <w:rFonts w:ascii="宋体" w:hAnsi="宋体" w:eastAsia="宋体"/>
+          <w:sz w:val="22"/>
+        </w:rPr>
+        <w:t>• ConcreteStrategy 是 OpenGLRenderer 与 WireframeRenderer，前者强调实体渲染，后者强调线框表达。</w:t>
+      </w:r>
+    </w:p>
+    <w:p>
+      <w:pPr>
+        <w:spacing w:line="360" w:lineRule="auto"/>
+        <w:ind w:left="360" w:hanging="200"/>
+      </w:pPr>
+      <w:r>
+        <w:rPr>
+          <w:rFonts w:ascii="宋体" w:hAnsi="宋体" w:eastAsia="宋体"/>
+          <w:sz w:val="22"/>
+        </w:rPr>
+        <w:t>• 当渲染需求改变时，只需要替换注入的 IRenderer 实现，而不需要修改 CADView 的业务逻辑。</w:t>
+      </w:r>
+    </w:p>
+    <w:p>
+      <w:r>
+        <w:drawing>
+          <wp:inline xmlns:a="http://schemas.openxmlformats.org/drawingml/2006/main" xmlns:pic="http://schemas.openxmlformats.org/drawingml/2006/picture">
+            <wp:extent cx="6126480" cy="3829050"/>
+            <wp:docPr id="3" name="Picture 3"/>
+            <wp:cNvGraphicFramePr>
+              <a:graphicFrameLocks noChangeAspect="1"/>
+            </wp:cNvGraphicFramePr>
+            <a:graphic>
+              <a:graphicData uri="http://schemas.openxmlformats.org/drawingml/2006/picture">
+                <pic:pic>
+                  <pic:nvPicPr>
+                    <pic:cNvPr id="0" name="strategy.png"/>
+                    <pic:cNvPicPr/>
+                  </pic:nvPicPr>
+                  <pic:blipFill>
+                    <a:blip r:embed="rId16"/>
+                    <a:stretch>
+                      <a:fillRect/>
+                    </a:stretch>
+                  </pic:blipFill>
+                  <pic:spPr>
+                    <a:xfrm>
+                      <a:off x="0" y="0"/>
+                      <a:ext cx="6126480" cy="3829050"/>
+                    </a:xfrm>
+                    <a:prstGeom prst="rect"/>
+                  </pic:spPr>
+                </pic:pic>
+              </a:graphicData>
+            </a:graphic>
+          </wp:inline>
+        </w:drawing>
+      </w:r>
+    </w:p>
+    <w:p>
+      <w:pPr>
+        <w:jc w:val="center"/>
+      </w:pPr>
+      <w:r>
+        <w:rPr>
+          <w:rFonts w:ascii="宋体" w:hAnsi="宋体" w:eastAsia="宋体"/>
+          <w:i/>
+          <w:sz w:val="21"/>
+        </w:rPr>
+        <w:t>图5 策略模式（Strategy） UML类图</w:t>
+      </w:r>
+    </w:p>
+    <w:p>
+      <w:pPr>
+        <w:spacing w:line="360" w:lineRule="auto"/>
+      </w:pPr>
+      <w:r>
+        <w:rPr>
+          <w:rFonts w:ascii="宋体" w:hAnsi="宋体" w:eastAsia="宋体"/>
+          <w:b/>
+          <w:sz w:val="22"/>
+        </w:rPr>
+        <w:t>源码角色对照表：</w:t>
+      </w:r>
+      <w:r>
+        <w:rPr>
+          <w:rFonts w:ascii="宋体" w:hAnsi="宋体" w:eastAsia="宋体"/>
+          <w:sz w:val="22"/>
+        </w:rPr>
+      </w:r>
+    </w:p>
+    <w:tbl>
+      <w:tblPr>
+        <w:tblW w:type="auto" w:w="0"/>
+        <w:tblLook w:firstColumn="1" w:firstRow="1" w:lastColumn="0" w:lastRow="0" w:noHBand="0" w:noVBand="1" w:val="04A0"/>
+      </w:tblPr>
+      <w:tblGrid>
+        <w:gridCol w:w="2769"/>
+        <w:gridCol w:w="2769"/>
+        <w:gridCol w:w="2769"/>
+      </w:tblGrid>
+      <w:tr>
+        <w:tc>
+          <w:tcPr>
+            <w:tcW w:type="dxa" w:w="2769"/>
+          </w:tcPr>
+          <w:p>
+            <w:r>
+              <w:rPr>
+                <w:sz w:val="21"/>
+              </w:rPr>
+              <w:t>类名</w:t>
+            </w:r>
+          </w:p>
+        </w:tc>
+        <w:tc>
+          <w:tcPr>
+            <w:tcW w:type="dxa" w:w="2769"/>
+          </w:tcPr>
+          <w:p>
+            <w:r>
+              <w:rPr>
+                <w:sz w:val="21"/>
+              </w:rPr>
+              <w:t>模式角色</w:t>
+            </w:r>
+          </w:p>
+        </w:tc>
+        <w:tc>
+          <w:tcPr>
+            <w:tcW w:type="dxa" w:w="2769"/>
+          </w:tcPr>
+          <w:p>
+            <w:r>
+              <w:rPr>
+                <w:sz w:val="21"/>
+              </w:rPr>
+              <w:t>源码文件路径</w:t>
+            </w:r>
+          </w:p>
+        </w:tc>
+      </w:tr>
+      <w:tr>
+        <w:tc>
+          <w:tcPr>
+            <w:tcW w:type="dxa" w:w="2769"/>
+          </w:tcPr>
+          <w:p>
+            <w:r>
+              <w:rPr>
+                <w:sz w:val="21"/>
+              </w:rPr>
+              <w:t>CADView</w:t>
+            </w:r>
+          </w:p>
+        </w:tc>
+        <w:tc>
+          <w:tcPr>
+            <w:tcW w:type="dxa" w:w="2769"/>
+          </w:tcPr>
+          <w:p>
+            <w:r>
+              <w:rPr>
+                <w:sz w:val="21"/>
+              </w:rPr>
+              <w:t>Context</w:t>
+            </w:r>
+          </w:p>
+        </w:tc>
+        <w:tc>
+          <w:tcPr>
+            <w:tcW w:type="dxa" w:w="2769"/>
+          </w:tcPr>
+          <w:p>
+            <w:r>
+              <w:rPr>
+                <w:sz w:val="21"/>
+              </w:rPr>
+              <w:t>作业2/三维CAD软件设计中单一职责原则的使用/CADFramework/Presentation/Views/CADView.cs</w:t>
+            </w:r>
+          </w:p>
+        </w:tc>
+      </w:tr>
+      <w:tr>
+        <w:tc>
+          <w:tcPr>
+            <w:tcW w:type="dxa" w:w="2769"/>
+          </w:tcPr>
+          <w:p>
+            <w:r>
+              <w:rPr>
+                <w:sz w:val="21"/>
+              </w:rPr>
+              <w:t>IRenderer</w:t>
+            </w:r>
+          </w:p>
+        </w:tc>
+        <w:tc>
+          <w:tcPr>
+            <w:tcW w:type="dxa" w:w="2769"/>
+          </w:tcPr>
+          <w:p>
+            <w:r>
+              <w:rPr>
+                <w:sz w:val="21"/>
+              </w:rPr>
+              <w:t>Strategy</w:t>
+            </w:r>
+          </w:p>
+        </w:tc>
+        <w:tc>
+          <w:tcPr>
+            <w:tcW w:type="dxa" w:w="2769"/>
+          </w:tcPr>
+          <w:p>
+            <w:r>
+              <w:rPr>
+                <w:sz w:val="21"/>
+              </w:rPr>
+              <w:t>作业2/三维CAD软件设计中单一职责原则的使用/CADFramework/Presentation/Renderers/IRenderer.cs</w:t>
+            </w:r>
+          </w:p>
+        </w:tc>
+      </w:tr>
+      <w:tr>
+        <w:tc>
+          <w:tcPr>
+            <w:tcW w:type="dxa" w:w="2769"/>
+          </w:tcPr>
+          <w:p>
+            <w:r>
+              <w:rPr>
+                <w:sz w:val="21"/>
+              </w:rPr>
+              <w:t>OpenGLRenderer</w:t>
+            </w:r>
+          </w:p>
+        </w:tc>
+        <w:tc>
+          <w:tcPr>
+            <w:tcW w:type="dxa" w:w="2769"/>
+          </w:tcPr>
+          <w:p>
+            <w:r>
+              <w:rPr>
+                <w:sz w:val="21"/>
+              </w:rPr>
+              <w:t>ConcreteStrategy</w:t>
+            </w:r>
+          </w:p>
+        </w:tc>
+        <w:tc>
+          <w:tcPr>
+            <w:tcW w:type="dxa" w:w="2769"/>
+          </w:tcPr>
+          <w:p>
+            <w:r>
+              <w:rPr>
+                <w:sz w:val="21"/>
+              </w:rPr>
+              <w:t>作业2/三维CAD软件设计中单一职责原则的使用/CADFramework/Presentation/Renderers/OpenGLRenderer.cs</w:t>
+            </w:r>
+          </w:p>
+        </w:tc>
+      </w:tr>
+      <w:tr>
+        <w:tc>
+          <w:tcPr>
+            <w:tcW w:type="dxa" w:w="2769"/>
+          </w:tcPr>
+          <w:p>
+            <w:r>
+              <w:rPr>
+                <w:sz w:val="21"/>
+              </w:rPr>
+              <w:t>WireframeRenderer</w:t>
+            </w:r>
+          </w:p>
+        </w:tc>
+        <w:tc>
+          <w:tcPr>
+            <w:tcW w:type="dxa" w:w="2769"/>
+          </w:tcPr>
+          <w:p>
+            <w:r>
+              <w:rPr>
+                <w:sz w:val="21"/>
+              </w:rPr>
+              <w:t>ConcreteStrategy</w:t>
+            </w:r>
+          </w:p>
+        </w:tc>
+        <w:tc>
+          <w:tcPr>
+            <w:tcW w:type="dxa" w:w="2769"/>
+          </w:tcPr>
+          <w:p>
+            <w:r>
+              <w:rPr>
+                <w:sz w:val="21"/>
+              </w:rPr>
+              <w:t>作业2/三维CAD软件设计中单一职责原则的使用/CADFramework/Presentation/Renderers/WireframeRenderer.cs</w:t>
+            </w:r>
+          </w:p>
+        </w:tc>
+      </w:tr>
+    </w:tbl>
+    <w:p/>
+    <w:p>
+      <w:pPr>
+        <w:spacing w:before="200" w:after="120"/>
+      </w:pPr>
+      <w:r>
+        <w:rPr>
+          <w:rFonts w:ascii="宋体" w:hAnsi="宋体" w:eastAsia="宋体"/>
+          <w:b/>
+          <w:sz w:val="28"/>
+        </w:rPr>
+        <w:t>2.6 桥接模式（Bridge）</w:t>
+      </w:r>
+    </w:p>
+    <w:p>
+      <w:pPr>
+        <w:spacing w:line="360" w:lineRule="auto"/>
+      </w:pPr>
+      <w:r>
+        <w:rPr>
+          <w:rFonts w:ascii="宋体" w:hAnsi="宋体" w:eastAsia="宋体"/>
+          <w:sz w:val="22"/>
+        </w:rPr>
+        <w:t>模式定位：该模式在项目中的出现不是孤立的，而是直接服务于 CAD 框架“可扩展、可替换、可联动”的工程目标。</w:t>
+      </w:r>
+    </w:p>
+    <w:p>
+      <w:pPr>
+        <w:spacing w:line="360" w:lineRule="auto"/>
+      </w:pPr>
+      <w:r>
+        <w:rPr>
+          <w:rFonts w:ascii="宋体" w:hAnsi="宋体" w:eastAsia="宋体"/>
+          <w:b/>
+          <w:sz w:val="22"/>
+        </w:rPr>
+        <w:t>设计目的：</w:t>
+      </w:r>
+      <w:r>
+        <w:rPr>
+          <w:rFonts w:ascii="宋体" w:hAnsi="宋体" w:eastAsia="宋体"/>
+          <w:sz w:val="22"/>
+        </w:rPr>
+        <w:t>桥接模式的目标是把抽象部分与实现部分分离，使二者可以独立变化，避免“一个视图类绑定一个具体渲染实现”造成的类爆炸。</w:t>
+      </w:r>
+    </w:p>
+    <w:p>
+      <w:pPr>
+        <w:spacing w:line="360" w:lineRule="auto"/>
+      </w:pPr>
+      <w:r>
+        <w:rPr>
+          <w:rFonts w:ascii="宋体" w:hAnsi="宋体" w:eastAsia="宋体"/>
+          <w:b/>
+          <w:sz w:val="22"/>
+        </w:rPr>
+        <w:t>项目落地效果：</w:t>
+      </w:r>
+      <w:r>
+        <w:rPr>
+          <w:rFonts w:ascii="宋体" w:hAnsi="宋体" w:eastAsia="宋体"/>
+          <w:sz w:val="22"/>
+        </w:rPr>
+        <w:t>本项目中 CADView 作为视图抽象，并不直接写死 OpenGL 或线框绘制细节，而是通过 IRenderer 建立桥接关联。因此在保留同一视图抽象的前提下，可以无痛替换渲染实现，满足 CAD 框架跨渲染方案扩展的工程需求。</w:t>
+      </w:r>
+    </w:p>
+    <w:p>
+      <w:pPr>
+        <w:spacing w:line="360" w:lineRule="auto"/>
+      </w:pPr>
+      <w:r>
+        <w:rPr>
+          <w:rFonts w:ascii="宋体" w:hAnsi="宋体" w:eastAsia="宋体"/>
+          <w:b/>
+          <w:sz w:val="22"/>
+        </w:rPr>
+        <w:t>标准角色拆解：</w:t>
+      </w:r>
+      <w:r>
+        <w:rPr>
+          <w:rFonts w:ascii="宋体" w:hAnsi="宋体" w:eastAsia="宋体"/>
+          <w:sz w:val="22"/>
+        </w:rPr>
+      </w:r>
+    </w:p>
+    <w:p>
+      <w:pPr>
+        <w:spacing w:line="360" w:lineRule="auto"/>
+        <w:ind w:left="360" w:hanging="200"/>
+      </w:pPr>
+      <w:r>
+        <w:rPr>
+          <w:rFonts w:ascii="宋体" w:hAnsi="宋体" w:eastAsia="宋体"/>
+          <w:sz w:val="22"/>
+        </w:rPr>
+        <w:t>• Abstraction 是 CADView，负责界面交互、刷新节奏与显示流程组织。</w:t>
+      </w:r>
+    </w:p>
+    <w:p>
+      <w:pPr>
+        <w:spacing w:line="360" w:lineRule="auto"/>
+        <w:ind w:left="360" w:hanging="200"/>
+      </w:pPr>
+      <w:r>
+        <w:rPr>
+          <w:rFonts w:ascii="宋体" w:hAnsi="宋体" w:eastAsia="宋体"/>
+          <w:sz w:val="22"/>
+        </w:rPr>
+        <w:t>• Implementor 是 IRenderer，负责定义底层渲染操作接口。</w:t>
+      </w:r>
+    </w:p>
+    <w:p>
+      <w:pPr>
+        <w:spacing w:line="360" w:lineRule="auto"/>
+        <w:ind w:left="360" w:hanging="200"/>
+      </w:pPr>
+      <w:r>
+        <w:rPr>
+          <w:rFonts w:ascii="宋体" w:hAnsi="宋体" w:eastAsia="宋体"/>
+          <w:sz w:val="22"/>
+        </w:rPr>
+        <w:t>• ConcreteImplementor 是 OpenGLRenderer 与 WireframeRenderer，分别提供不同的底层渲染实现。</w:t>
+      </w:r>
+    </w:p>
+    <w:p>
+      <w:pPr>
+        <w:spacing w:line="360" w:lineRule="auto"/>
+        <w:ind w:left="360" w:hanging="200"/>
+      </w:pPr>
+      <w:r>
+        <w:rPr>
+          <w:rFonts w:ascii="宋体" w:hAnsi="宋体" w:eastAsia="宋体"/>
+          <w:sz w:val="22"/>
+        </w:rPr>
+        <w:t>• CADView 通过组合关系持有 IRenderer，这种“抽象持有实现”的结构正是桥接模式的核心。</w:t>
+      </w:r>
+    </w:p>
+    <w:p>
+      <w:pPr>
+        <w:spacing w:line="360" w:lineRule="auto"/>
+        <w:ind w:left="360" w:hanging="200"/>
+      </w:pPr>
+      <w:r>
+        <w:rPr>
+          <w:rFonts w:ascii="宋体" w:hAnsi="宋体" w:eastAsia="宋体"/>
+          <w:sz w:val="22"/>
+        </w:rPr>
+        <w:t>• GeometryObserver、SelectionManager、CommandProcessor 作为桥接层协作者，进一步保证几何内核与 UI 之间通过中间层通信，而不是直接耦合。</w:t>
+      </w:r>
+    </w:p>
+    <w:p>
+      <w:r>
+        <w:drawing>
+          <wp:inline xmlns:a="http://schemas.openxmlformats.org/drawingml/2006/main" xmlns:pic="http://schemas.openxmlformats.org/drawingml/2006/picture">
+            <wp:extent cx="6126480" cy="3829050"/>
+            <wp:docPr id="4" name="Picture 4"/>
+            <wp:cNvGraphicFramePr>
+              <a:graphicFrameLocks noChangeAspect="1"/>
+            </wp:cNvGraphicFramePr>
+            <a:graphic>
+              <a:graphicData uri="http://schemas.openxmlformats.org/drawingml/2006/picture">
+                <pic:pic>
+                  <pic:nvPicPr>
+                    <pic:cNvPr id="0" name="bridge.png"/>
+                    <pic:cNvPicPr/>
+                  </pic:nvPicPr>
+                  <pic:blipFill>
+                    <a:blip r:embed="rId17"/>
+                    <a:stretch>
+                      <a:fillRect/>
+                    </a:stretch>
+                  </pic:blipFill>
+                  <pic:spPr>
+                    <a:xfrm>
+                      <a:off x="0" y="0"/>
+                      <a:ext cx="6126480" cy="3829050"/>
+                    </a:xfrm>
+                    <a:prstGeom prst="rect"/>
+                  </pic:spPr>
+                </pic:pic>
+              </a:graphicData>
+            </a:graphic>
+          </wp:inline>
+        </w:drawing>
+      </w:r>
+    </w:p>
+    <w:p>
+      <w:pPr>
+        <w:jc w:val="center"/>
+      </w:pPr>
+      <w:r>
+        <w:rPr>
+          <w:rFonts w:ascii="宋体" w:hAnsi="宋体" w:eastAsia="宋体"/>
+          <w:i/>
+          <w:sz w:val="21"/>
+        </w:rPr>
+        <w:t>图6 桥接模式（Bridge） UML类图</w:t>
+      </w:r>
+    </w:p>
+    <w:p>
+      <w:pPr>
+        <w:spacing w:line="360" w:lineRule="auto"/>
+      </w:pPr>
+      <w:r>
+        <w:rPr>
+          <w:rFonts w:ascii="宋体" w:hAnsi="宋体" w:eastAsia="宋体"/>
+          <w:b/>
+          <w:sz w:val="22"/>
+        </w:rPr>
+        <w:t>源码角色对照表：</w:t>
+      </w:r>
+      <w:r>
+        <w:rPr>
+          <w:rFonts w:ascii="宋体" w:hAnsi="宋体" w:eastAsia="宋体"/>
+          <w:sz w:val="22"/>
+        </w:rPr>
+      </w:r>
+    </w:p>
+    <w:tbl>
+      <w:tblPr>
+        <w:tblW w:type="auto" w:w="0"/>
+        <w:tblLook w:firstColumn="1" w:firstRow="1" w:lastColumn="0" w:lastRow="0" w:noHBand="0" w:noVBand="1" w:val="04A0"/>
+      </w:tblPr>
+      <w:tblGrid>
+        <w:gridCol w:w="2769"/>
+        <w:gridCol w:w="2769"/>
+        <w:gridCol w:w="2769"/>
+      </w:tblGrid>
+      <w:tr>
+        <w:tc>
+          <w:tcPr>
+            <w:tcW w:type="dxa" w:w="2769"/>
+          </w:tcPr>
+          <w:p>
+            <w:r>
+              <w:rPr>
+                <w:sz w:val="21"/>
+              </w:rPr>
+              <w:t>类名</w:t>
+            </w:r>
+          </w:p>
+        </w:tc>
+        <w:tc>
+          <w:tcPr>
+            <w:tcW w:type="dxa" w:w="2769"/>
+          </w:tcPr>
+          <w:p>
+            <w:r>
+              <w:rPr>
+                <w:sz w:val="21"/>
+              </w:rPr>
+              <w:t>模式角色</w:t>
+            </w:r>
+          </w:p>
+        </w:tc>
+        <w:tc>
+          <w:tcPr>
+            <w:tcW w:type="dxa" w:w="2769"/>
+          </w:tcPr>
+          <w:p>
+            <w:r>
+              <w:rPr>
+                <w:sz w:val="21"/>
+              </w:rPr>
+              <w:t>源码文件路径</w:t>
+            </w:r>
+          </w:p>
+        </w:tc>
+      </w:tr>
+      <w:tr>
+        <w:tc>
+          <w:tcPr>
+            <w:tcW w:type="dxa" w:w="2769"/>
+          </w:tcPr>
+          <w:p>
+            <w:r>
+              <w:rPr>
+                <w:sz w:val="21"/>
+              </w:rPr>
+              <w:t>CADView</w:t>
+            </w:r>
+          </w:p>
+        </w:tc>
+        <w:tc>
+          <w:tcPr>
+            <w:tcW w:type="dxa" w:w="2769"/>
+          </w:tcPr>
+          <w:p>
+            <w:r>
+              <w:rPr>
+                <w:sz w:val="21"/>
+              </w:rPr>
+              <w:t>Abstraction</w:t>
+            </w:r>
+          </w:p>
+        </w:tc>
+        <w:tc>
+          <w:tcPr>
+            <w:tcW w:type="dxa" w:w="2769"/>
+          </w:tcPr>
+          <w:p>
+            <w:r>
+              <w:rPr>
+                <w:sz w:val="21"/>
+              </w:rPr>
+              <w:t>作业2/三维CAD软件设计中单一职责原则的使用/CADFramework/Presentation/Views/CADView.cs</w:t>
+            </w:r>
+          </w:p>
+        </w:tc>
+      </w:tr>
+      <w:tr>
+        <w:tc>
+          <w:tcPr>
+            <w:tcW w:type="dxa" w:w="2769"/>
+          </w:tcPr>
+          <w:p>
+            <w:r>
+              <w:rPr>
+                <w:sz w:val="21"/>
+              </w:rPr>
+              <w:t>IRenderer</w:t>
+            </w:r>
+          </w:p>
+        </w:tc>
+        <w:tc>
+          <w:tcPr>
+            <w:tcW w:type="dxa" w:w="2769"/>
+          </w:tcPr>
+          <w:p>
+            <w:r>
+              <w:rPr>
+                <w:sz w:val="21"/>
+              </w:rPr>
+              <w:t>Implementor</w:t>
+            </w:r>
+          </w:p>
+        </w:tc>
+        <w:tc>
+          <w:tcPr>
+            <w:tcW w:type="dxa" w:w="2769"/>
+          </w:tcPr>
+          <w:p>
+            <w:r>
+              <w:rPr>
+                <w:sz w:val="21"/>
+              </w:rPr>
+              <w:t>作业2/三维CAD软件设计中单一职责原则的使用/CADFramework/Presentation/Renderers/IRenderer.cs</w:t>
+            </w:r>
+          </w:p>
+        </w:tc>
+      </w:tr>
+      <w:tr>
+        <w:tc>
+          <w:tcPr>
+            <w:tcW w:type="dxa" w:w="2769"/>
+          </w:tcPr>
+          <w:p>
+            <w:r>
+              <w:rPr>
+                <w:sz w:val="21"/>
+              </w:rPr>
+              <w:t>OpenGLRenderer</w:t>
+            </w:r>
+          </w:p>
+        </w:tc>
+        <w:tc>
+          <w:tcPr>
+            <w:tcW w:type="dxa" w:w="2769"/>
+          </w:tcPr>
+          <w:p>
+            <w:r>
+              <w:rPr>
+                <w:sz w:val="21"/>
+              </w:rPr>
+              <w:t>ConcreteImplementor</w:t>
+            </w:r>
+          </w:p>
+        </w:tc>
+        <w:tc>
+          <w:tcPr>
+            <w:tcW w:type="dxa" w:w="2769"/>
+          </w:tcPr>
+          <w:p>
+            <w:r>
+              <w:rPr>
+                <w:sz w:val="21"/>
+              </w:rPr>
+              <w:t>作业2/三维CAD软件设计中单一职责原则的使用/CADFramework/Presentation/Renderers/OpenGLRenderer.cs</w:t>
+            </w:r>
+          </w:p>
+        </w:tc>
+      </w:tr>
+      <w:tr>
+        <w:tc>
+          <w:tcPr>
+            <w:tcW w:type="dxa" w:w="2769"/>
+          </w:tcPr>
+          <w:p>
+            <w:r>
+              <w:rPr>
+                <w:sz w:val="21"/>
+              </w:rPr>
+              <w:t>WireframeRenderer</w:t>
+            </w:r>
+          </w:p>
+        </w:tc>
+        <w:tc>
+          <w:tcPr>
+            <w:tcW w:type="dxa" w:w="2769"/>
+          </w:tcPr>
+          <w:p>
+            <w:r>
+              <w:rPr>
+                <w:sz w:val="21"/>
+              </w:rPr>
+              <w:t>ConcreteImplementor</w:t>
+            </w:r>
+          </w:p>
+        </w:tc>
+        <w:tc>
+          <w:tcPr>
+            <w:tcW w:type="dxa" w:w="2769"/>
+          </w:tcPr>
+          <w:p>
+            <w:r>
+              <w:rPr>
+                <w:sz w:val="21"/>
+              </w:rPr>
+              <w:t>作业2/三维CAD软件设计中单一职责原则的使用/CADFramework/Presentation/Renderers/WireframeRenderer.cs</w:t>
+            </w:r>
+          </w:p>
+        </w:tc>
+      </w:tr>
+      <w:tr>
+        <w:tc>
+          <w:tcPr>
+            <w:tcW w:type="dxa" w:w="2769"/>
+          </w:tcPr>
+          <w:p>
+            <w:r>
+              <w:rPr>
+                <w:sz w:val="21"/>
+              </w:rPr>
+              <w:t>GeometryObserver / CommandProcessor</w:t>
+            </w:r>
+          </w:p>
+        </w:tc>
+        <w:tc>
+          <w:tcPr>
+            <w:tcW w:type="dxa" w:w="2769"/>
+          </w:tcPr>
+          <w:p>
+            <w:r>
+              <w:rPr>
+                <w:sz w:val="21"/>
+              </w:rPr>
+              <w:t>桥接协作对象</w:t>
+            </w:r>
+          </w:p>
+        </w:tc>
+        <w:tc>
+          <w:tcPr>
+            <w:tcW w:type="dxa" w:w="2769"/>
+          </w:tcPr>
+          <w:p>
+            <w:r>
+              <w:rPr>
+                <w:sz w:val="21"/>
+              </w:rPr>
+              <w:t>作业2/三维CAD软件设计中单一职责原则的使用/CADFramework/Bridge/GeometryObserver.cs；作业2/三维CAD软件设计中单一职责原则的使用/CADFramework/Bridge/CommandProcessor.cs</w:t>
+            </w:r>
+          </w:p>
+        </w:tc>
+      </w:tr>
+    </w:tbl>
+    <w:p/>
+    <w:p>
+      <w:pPr>
+        <w:spacing w:before="200" w:after="120"/>
+      </w:pPr>
+      <w:r>
+        <w:rPr>
+          <w:rFonts w:ascii="宋体" w:hAnsi="宋体" w:eastAsia="宋体"/>
+          <w:b/>
+          <w:sz w:val="28"/>
+        </w:rPr>
+        <w:t>2.7 单例模式（Singleton，额外挖掘）</w:t>
+      </w:r>
+    </w:p>
+    <w:p>
+      <w:pPr>
+        <w:spacing w:line="360" w:lineRule="auto"/>
+      </w:pPr>
+      <w:r>
+        <w:rPr>
+          <w:rFonts w:ascii="宋体" w:hAnsi="宋体" w:eastAsia="宋体"/>
+          <w:sz w:val="22"/>
+        </w:rPr>
+        <w:t>模式定位：该模式在项目中的出现不是孤立的，而是直接服务于 CAD 框架“可扩展、可替换、可联动”的工程目标。</w:t>
+      </w:r>
+    </w:p>
+    <w:p>
+      <w:pPr>
+        <w:spacing w:line="360" w:lineRule="auto"/>
+      </w:pPr>
+      <w:r>
+        <w:rPr>
+          <w:rFonts w:ascii="宋体" w:hAnsi="宋体" w:eastAsia="宋体"/>
+          <w:b/>
+          <w:sz w:val="22"/>
+        </w:rPr>
+        <w:t>设计目的：</w:t>
+      </w:r>
+      <w:r>
+        <w:rPr>
+          <w:rFonts w:ascii="宋体" w:hAnsi="宋体" w:eastAsia="宋体"/>
+          <w:sz w:val="22"/>
+        </w:rPr>
+        <w:t>单例模式用于保证系统中某个核心服务只有一个全局访问入口，避免事件总线出现多个实例而导致订阅关系割裂。</w:t>
+      </w:r>
+    </w:p>
+    <w:p>
+      <w:pPr>
+        <w:spacing w:line="360" w:lineRule="auto"/>
+      </w:pPr>
+      <w:r>
+        <w:rPr>
+          <w:rFonts w:ascii="宋体" w:hAnsi="宋体" w:eastAsia="宋体"/>
+          <w:b/>
+          <w:sz w:val="22"/>
+        </w:rPr>
+        <w:t>项目落地效果：</w:t>
+      </w:r>
+      <w:r>
+        <w:rPr>
+          <w:rFonts w:ascii="宋体" w:hAnsi="宋体" w:eastAsia="宋体"/>
+          <w:sz w:val="22"/>
+        </w:rPr>
+        <w:t>GeometryEventPublisher 通过静态字段与 Instance 属性提供唯一事件发布器，使 DrawController、SelectionManager、GeometryObserver 等对象都围绕同一个事件中心进行发布与订阅，保证了几何事件传播的一致性。</w:t>
+      </w:r>
+    </w:p>
+    <w:p>
+      <w:pPr>
+        <w:spacing w:line="360" w:lineRule="auto"/>
+      </w:pPr>
+      <w:r>
+        <w:rPr>
+          <w:rFonts w:ascii="宋体" w:hAnsi="宋体" w:eastAsia="宋体"/>
+          <w:b/>
+          <w:sz w:val="22"/>
+        </w:rPr>
+        <w:t>标准角色拆解：</w:t>
+      </w:r>
+      <w:r>
+        <w:rPr>
+          <w:rFonts w:ascii="宋体" w:hAnsi="宋体" w:eastAsia="宋体"/>
+          <w:sz w:val="22"/>
+        </w:rPr>
+      </w:r>
+    </w:p>
+    <w:p>
+      <w:pPr>
+        <w:spacing w:line="360" w:lineRule="auto"/>
+        <w:ind w:left="360" w:hanging="200"/>
+      </w:pPr>
+      <w:r>
+        <w:rPr>
+          <w:rFonts w:ascii="宋体" w:hAnsi="宋体" w:eastAsia="宋体"/>
+          <w:sz w:val="22"/>
+        </w:rPr>
+        <w:t>• GeometryEventPublisher 内部维护 private static GeometryEventPublisher _instance，并通过 public static GeometryEventPublisher Instance 延迟创建对象。</w:t>
+      </w:r>
+    </w:p>
+    <w:p>
+      <w:pPr>
+        <w:spacing w:line="360" w:lineRule="auto"/>
+        <w:ind w:left="360" w:hanging="200"/>
+      </w:pPr>
+      <w:r>
+        <w:rPr>
+          <w:rFonts w:ascii="宋体" w:hAnsi="宋体" w:eastAsia="宋体"/>
+          <w:sz w:val="22"/>
+        </w:rPr>
+        <w:t>• 外部调用方并不直接 new 发布器，而是统一通过 GeometryEventPublisher.Instance 获取唯一实例。</w:t>
+      </w:r>
+    </w:p>
+    <w:p>
+      <w:pPr>
+        <w:spacing w:line="360" w:lineRule="auto"/>
+        <w:ind w:left="360" w:hanging="200"/>
+      </w:pPr>
+      <w:r>
+        <w:rPr>
+          <w:rFonts w:ascii="宋体" w:hAnsi="宋体" w:eastAsia="宋体"/>
+          <w:sz w:val="22"/>
+        </w:rPr>
+        <w:t>• 这样做的工程收益是：几何事件发布口唯一、订阅点统一、跨模块通信路径稳定，避免出现“某些事件发到了另一个发布器实例上”的问题。</w:t>
+      </w:r>
+    </w:p>
+    <w:p>
+      <w:r>
+        <w:drawing>
+          <wp:inline xmlns:a="http://schemas.openxmlformats.org/drawingml/2006/main" xmlns:pic="http://schemas.openxmlformats.org/drawingml/2006/picture">
+            <wp:extent cx="6126480" cy="3829050"/>
+            <wp:docPr id="5" name="Picture 5"/>
+            <wp:cNvGraphicFramePr>
+              <a:graphicFrameLocks noChangeAspect="1"/>
+            </wp:cNvGraphicFramePr>
+            <a:graphic>
+              <a:graphicData uri="http://schemas.openxmlformats.org/drawingml/2006/picture">
+                <pic:pic>
+                  <pic:nvPicPr>
+                    <pic:cNvPr id="0" name="singleton.png"/>
+                    <pic:cNvPicPr/>
+                  </pic:nvPicPr>
+                  <pic:blipFill>
+                    <a:blip r:embed="rId18"/>
+                    <a:stretch>
+                      <a:fillRect/>
+                    </a:stretch>
+                  </pic:blipFill>
+                  <pic:spPr>
+                    <a:xfrm>
+                      <a:off x="0" y="0"/>
+                      <a:ext cx="6126480" cy="3829050"/>
+                    </a:xfrm>
+                    <a:prstGeom prst="rect"/>
+                  </pic:spPr>
+                </pic:pic>
+              </a:graphicData>
+            </a:graphic>
+          </wp:inline>
+        </w:drawing>
+      </w:r>
+    </w:p>
+    <w:p>
+      <w:pPr>
+        <w:jc w:val="center"/>
+      </w:pPr>
+      <w:r>
+        <w:rPr>
+          <w:rFonts w:ascii="宋体" w:hAnsi="宋体" w:eastAsia="宋体"/>
+          <w:i/>
+          <w:sz w:val="21"/>
+        </w:rPr>
+        <w:t>图7 单例模式（Singleton，额外挖掘） UML类图</w:t>
+      </w:r>
+    </w:p>
+    <w:p>
+      <w:pPr>
+        <w:spacing w:line="360" w:lineRule="auto"/>
+      </w:pPr>
+      <w:r>
+        <w:rPr>
+          <w:rFonts w:ascii="宋体" w:hAnsi="宋体" w:eastAsia="宋体"/>
+          <w:b/>
+          <w:sz w:val="22"/>
+        </w:rPr>
+        <w:t>源码角色对照表：</w:t>
+      </w:r>
+      <w:r>
+        <w:rPr>
+          <w:rFonts w:ascii="宋体" w:hAnsi="宋体" w:eastAsia="宋体"/>
+          <w:sz w:val="22"/>
+        </w:rPr>
+      </w:r>
+    </w:p>
+    <w:tbl>
+      <w:tblPr>
+        <w:tblW w:type="auto" w:w="0"/>
+        <w:tblLook w:firstColumn="1" w:firstRow="1" w:lastColumn="0" w:lastRow="0" w:noHBand="0" w:noVBand="1" w:val="04A0"/>
+      </w:tblPr>
+      <w:tblGrid>
+        <w:gridCol w:w="2769"/>
+        <w:gridCol w:w="2769"/>
+        <w:gridCol w:w="2769"/>
+      </w:tblGrid>
+      <w:tr>
+        <w:tc>
+          <w:tcPr>
+            <w:tcW w:type="dxa" w:w="2769"/>
+          </w:tcPr>
+          <w:p>
+            <w:r>
+              <w:rPr>
+                <w:sz w:val="21"/>
+              </w:rPr>
+              <w:t>类名</w:t>
+            </w:r>
+          </w:p>
+        </w:tc>
+        <w:tc>
+          <w:tcPr>
+            <w:tcW w:type="dxa" w:w="2769"/>
+          </w:tcPr>
+          <w:p>
+            <w:r>
+              <w:rPr>
+                <w:sz w:val="21"/>
+              </w:rPr>
+              <w:t>模式角色</w:t>
+            </w:r>
+          </w:p>
+        </w:tc>
+        <w:tc>
+          <w:tcPr>
+            <w:tcW w:type="dxa" w:w="2769"/>
+          </w:tcPr>
+          <w:p>
+            <w:r>
+              <w:rPr>
+                <w:sz w:val="21"/>
+              </w:rPr>
+              <w:t>源码文件路径</w:t>
+            </w:r>
+          </w:p>
+        </w:tc>
+      </w:tr>
+      <w:tr>
+        <w:tc>
+          <w:tcPr>
+            <w:tcW w:type="dxa" w:w="2769"/>
+          </w:tcPr>
+          <w:p>
+            <w:r>
+              <w:rPr>
+                <w:sz w:val="21"/>
+              </w:rPr>
+              <w:t>GeometryEventPublisher</w:t>
+            </w:r>
+          </w:p>
+        </w:tc>
+        <w:tc>
+          <w:tcPr>
+            <w:tcW w:type="dxa" w:w="2769"/>
+          </w:tcPr>
+          <w:p>
+            <w:r>
+              <w:rPr>
+                <w:sz w:val="21"/>
+              </w:rPr>
+              <w:t>Singleton</w:t>
+            </w:r>
+          </w:p>
+        </w:tc>
+        <w:tc>
+          <w:tcPr>
+            <w:tcW w:type="dxa" w:w="2769"/>
+          </w:tcPr>
+          <w:p>
+            <w:r>
+              <w:rPr>
+                <w:sz w:val="21"/>
+              </w:rPr>
+              <w:t>作业2/三维CAD软件设计中单一职责原则的使用/CADFramework/GeometryKernel/Events/GeometryEvent.cs</w:t>
+            </w:r>
+          </w:p>
+        </w:tc>
+      </w:tr>
+      <w:tr>
+        <w:tc>
+          <w:tcPr>
+            <w:tcW w:type="dxa" w:w="2769"/>
+          </w:tcPr>
+          <w:p>
+            <w:r>
+              <w:rPr>
+                <w:sz w:val="21"/>
+              </w:rPr>
+              <w:t>_instance / Instance</w:t>
+            </w:r>
+          </w:p>
+        </w:tc>
+        <w:tc>
+          <w:tcPr>
+            <w:tcW w:type="dxa" w:w="2769"/>
+          </w:tcPr>
+          <w:p>
+            <w:r>
+              <w:rPr>
+                <w:sz w:val="21"/>
+              </w:rPr>
+              <w:t>唯一实例访问点</w:t>
+            </w:r>
+          </w:p>
+        </w:tc>
+        <w:tc>
+          <w:tcPr>
+            <w:tcW w:type="dxa" w:w="2769"/>
+          </w:tcPr>
+          <w:p>
+            <w:r>
+              <w:rPr>
+                <w:sz w:val="21"/>
+              </w:rPr>
+              <w:t>作业2/三维CAD软件设计中单一职责原则的使用/CADFramework/GeometryKernel/Events/GeometryEvent.cs</w:t>
+            </w:r>
+          </w:p>
+        </w:tc>
+      </w:tr>
+      <w:tr>
+        <w:tc>
+          <w:tcPr>
+            <w:tcW w:type="dxa" w:w="2769"/>
+          </w:tcPr>
+          <w:p>
+            <w:r>
+              <w:rPr>
+                <w:sz w:val="21"/>
+              </w:rPr>
+              <w:t>GeometryObserver</w:t>
+            </w:r>
+          </w:p>
+        </w:tc>
+        <w:tc>
+          <w:tcPr>
+            <w:tcW w:type="dxa" w:w="2769"/>
+          </w:tcPr>
+          <w:p>
+            <w:r>
+              <w:rPr>
+                <w:sz w:val="21"/>
+              </w:rPr>
+              <w:t>Singleton Client</w:t>
+            </w:r>
+          </w:p>
+        </w:tc>
+        <w:tc>
+          <w:tcPr>
+            <w:tcW w:type="dxa" w:w="2769"/>
+          </w:tcPr>
+          <w:p>
+            <w:r>
+              <w:rPr>
+                <w:sz w:val="21"/>
+              </w:rPr>
+              <w:t>作业2/三维CAD软件设计中单一职责原则的使用/CADFramework/Bridge/GeometryObserver.cs</w:t>
+            </w:r>
+          </w:p>
+        </w:tc>
+      </w:tr>
+      <w:tr>
+        <w:tc>
+          <w:tcPr>
+            <w:tcW w:type="dxa" w:w="2769"/>
+          </w:tcPr>
+          <w:p>
+            <w:r>
+              <w:rPr>
+                <w:sz w:val="21"/>
+              </w:rPr>
+              <w:t>SelectionManager</w:t>
+            </w:r>
+          </w:p>
+        </w:tc>
+        <w:tc>
+          <w:tcPr>
+            <w:tcW w:type="dxa" w:w="2769"/>
+          </w:tcPr>
+          <w:p>
+            <w:r>
+              <w:rPr>
+                <w:sz w:val="21"/>
+              </w:rPr>
+              <w:t>Singleton Client</w:t>
+            </w:r>
+          </w:p>
+        </w:tc>
+        <w:tc>
+          <w:tcPr>
+            <w:tcW w:type="dxa" w:w="2769"/>
+          </w:tcPr>
+          <w:p>
+            <w:r>
+              <w:rPr>
+                <w:sz w:val="21"/>
+              </w:rPr>
+              <w:t>作业2/三维CAD软件设计中单一职责原则的使用/CADFramework/Bridge/SelectionManager.cs</w:t>
+            </w:r>
+          </w:p>
+        </w:tc>
+      </w:tr>
+      <w:tr>
+        <w:tc>
+          <w:tcPr>
+            <w:tcW w:type="dxa" w:w="2769"/>
+          </w:tcPr>
+          <w:p>
+            <w:r>
+              <w:rPr>
+                <w:sz w:val="21"/>
+              </w:rPr>
+              <w:t>DrawController</w:t>
+            </w:r>
+          </w:p>
+        </w:tc>
+        <w:tc>
+          <w:tcPr>
+            <w:tcW w:type="dxa" w:w="2769"/>
+          </w:tcPr>
+          <w:p>
+            <w:r>
+              <w:rPr>
+                <w:sz w:val="21"/>
+              </w:rPr>
+              <w:t>Singleton Client</w:t>
+            </w:r>
+          </w:p>
+        </w:tc>
+        <w:tc>
+          <w:tcPr>
+            <w:tcW w:type="dxa" w:w="2769"/>
+          </w:tcPr>
+          <w:p>
+            <w:r>
+              <w:rPr>
+                <w:sz w:val="21"/>
+              </w:rPr>
+              <w:t>作业2/三维CAD软件设计中单一职责原则的使用/CADFramework/Presentation/Controllers/DrawController.cs</w:t>
+            </w:r>
+          </w:p>
+        </w:tc>
+      </w:tr>
+    </w:tbl>
+    <w:p/>
+    <w:p>
+      <w:pPr>
+        <w:spacing w:before="200" w:after="120"/>
+      </w:pPr>
+      <w:r>
+        <w:rPr>
+          <w:rFonts w:ascii="宋体" w:hAnsi="宋体" w:eastAsia="宋体"/>
+          <w:b/>
+          <w:sz w:val="28"/>
+        </w:rPr>
+        <w:t>2.8 综合结论</w:t>
+      </w:r>
+    </w:p>
+    <w:p>
+      <w:pPr>
+        <w:spacing w:line="360" w:lineRule="auto"/>
+      </w:pPr>
+      <w:r>
+        <w:rPr>
+          <w:rFonts w:ascii="宋体" w:hAnsi="宋体" w:eastAsia="宋体"/>
+          <w:sz w:val="22"/>
+        </w:rPr>
+        <w:t>综上，CADFramework 至少稳定体现了 4 种核心设计模式：命令模式、观察者模式、策略模式、桥接模式；同时 GeometryEventPublisher 还额外体现了单例模式。它们共同支撑了该 CAD 框架的三类关键能力：第一，用户操作可封装并支持撤销重做；第二，几何变化可通过事件链路实时同步到界面；第三，视图抽象可以在不改业务逻辑的情况下替换底层渲染实现。</w:t>
+      </w:r>
+    </w:p>
+    <w:p>
+      <w:pPr>
+        <w:spacing w:line="360" w:lineRule="auto"/>
+      </w:pPr>
+      <w:r>
+        <w:rPr>
+          <w:rFonts w:ascii="宋体" w:hAnsi="宋体" w:eastAsia="宋体"/>
+          <w:sz w:val="22"/>
+        </w:rPr>
+        <w:t>因此，该项目并不是把设计模式机械堆叠在一起，而是把模式落到了“交互命令、事件传播、渲染替换、层间解耦”这些真实工程问题上，既符合软件体系结构课程对理论严谨性的要求，也能体现结合源码进行实操分析的深度。</w:t>
       </w:r>
     </w:p>
     <w:sectPr>

</xml_diff>